<commit_message>
Added Leaderboard User Manual Information
</commit_message>
<xml_diff>
--- a/IBM_SkillsBuild_Gamification_User_Manual.docx
+++ b/IBM_SkillsBuild_Gamification_User_Manual.docx
@@ -640,7 +640,14 @@
       </w:pPr>
       <w:r>
         <w:rPr/>
-        <w:t>2. Leaderboard</w:t>
+        <w:t xml:space="preserve">2. </w:t>
+      </w:r>
+      <w:r>
+        <w:rPr>
+          <w:b/>
+          <w:bCs/>
+        </w:rPr>
+        <w:t>Leaderboard</w:t>
       </w:r>
     </w:p>
     <w:p>
@@ -661,10 +668,1231 @@
         </w:rPr>
       </w:pPr>
       <w:r>
+        <w:drawing>
+          <wp:anchor behindDoc="0" distT="0" distB="0" distL="0" distR="0" simplePos="0" locked="0" layoutInCell="0" allowOverlap="1" relativeHeight="4">
+            <wp:simplePos x="0" y="0"/>
+            <wp:positionH relativeFrom="column">
+              <wp:posOffset>-509905</wp:posOffset>
+            </wp:positionH>
+            <wp:positionV relativeFrom="paragraph">
+              <wp:posOffset>127000</wp:posOffset>
+            </wp:positionV>
+            <wp:extent cx="6840220" cy="1850390"/>
+            <wp:effectExtent l="0" t="0" r="0" b="0"/>
+            <wp:wrapSquare wrapText="largest"/>
+            <wp:docPr id="3" name="Image1" descr=""/>
+            <wp:cNvGraphicFramePr>
+              <a:graphicFrameLocks xmlns:a="http://schemas.openxmlformats.org/drawingml/2006/main" noChangeAspect="1"/>
+            </wp:cNvGraphicFramePr>
+            <a:graphic xmlns:a="http://schemas.openxmlformats.org/drawingml/2006/main">
+              <a:graphicData uri="http://schemas.openxmlformats.org/drawingml/2006/picture">
+                <pic:pic xmlns:pic="http://schemas.openxmlformats.org/drawingml/2006/picture">
+                  <pic:nvPicPr>
+                    <pic:cNvPr id="3" name="Image1" descr=""/>
+                    <pic:cNvPicPr>
+                      <a:picLocks noChangeAspect="1" noChangeArrowheads="1"/>
+                    </pic:cNvPicPr>
+                  </pic:nvPicPr>
+                  <pic:blipFill>
+                    <a:blip r:embed="rId4"/>
+                    <a:stretch>
+                      <a:fillRect/>
+                    </a:stretch>
+                  </pic:blipFill>
+                  <pic:spPr bwMode="auto">
+                    <a:xfrm>
+                      <a:off x="0" y="0"/>
+                      <a:ext cx="6840220" cy="1850390"/>
+                    </a:xfrm>
+                    <a:prstGeom prst="rect">
+                      <a:avLst/>
+                    </a:prstGeom>
+                  </pic:spPr>
+                </pic:pic>
+              </a:graphicData>
+            </a:graphic>
+          </wp:anchor>
+        </w:drawing>
+      </w:r>
+      <w:r>
         <w:rPr>
           <w:u w:val="single"/>
         </w:rPr>
-        <w:t>2.1 Leaderboard Page overview</w:t>
+        <w:t>2.1</w:t>
+      </w:r>
+    </w:p>
+    <w:p>
+      <w:pPr>
+        <w:pStyle w:val="Normal"/>
+        <w:rPr/>
+      </w:pPr>
+      <w:r>
+        <w:rPr/>
+        <w:t>Sorting: Users are met by the leader board page, when pressing the leaderboard button on the dashboard page, where they will see some information about sorting the leaderboard. Each button corresponds to a way to sort the leaderboard, for example, sorting by lowest points first, sorting alphabetically (usernames A – Z) or sorting by the number of courses completed.</w:t>
+      </w:r>
+    </w:p>
+    <w:p>
+      <w:pPr>
+        <w:pStyle w:val="Normal"/>
+        <w:rPr/>
+      </w:pPr>
+      <w:r>
+        <w:rPr/>
+      </w:r>
+    </w:p>
+    <w:p>
+      <w:pPr>
+        <w:pStyle w:val="Normal"/>
+        <w:rPr/>
+      </w:pPr>
+      <w:r>
+        <w:rPr/>
+        <w:t>Positions will only be shown when sorting by highest points first, as this is the primary metric of the leader board, and it may cause confusion if users see positions for other sorting methods, that do not measure performance.</w:t>
+      </w:r>
+    </w:p>
+    <w:p>
+      <w:pPr>
+        <w:pStyle w:val="Normal"/>
+        <w:rPr/>
+      </w:pPr>
+      <w:r>
+        <w:rPr/>
+      </w:r>
+      <w:r>
+        <mc:AlternateContent>
+          <mc:Choice Requires="wps">
+            <w:drawing>
+              <wp:anchor behindDoc="0" distT="0" distB="0" distL="0" distR="0" simplePos="0" locked="0" layoutInCell="0" allowOverlap="1" relativeHeight="7">
+                <wp:simplePos x="0" y="0"/>
+                <wp:positionH relativeFrom="column">
+                  <wp:posOffset>1157605</wp:posOffset>
+                </wp:positionH>
+                <wp:positionV relativeFrom="paragraph">
+                  <wp:posOffset>36830</wp:posOffset>
+                </wp:positionV>
+                <wp:extent cx="3199130" cy="1196340"/>
+                <wp:effectExtent l="0" t="0" r="0" b="0"/>
+                <wp:wrapSquare wrapText="largest"/>
+                <wp:docPr id="4" name="Frame2"/>
+                <a:graphic xmlns:a="http://schemas.openxmlformats.org/drawingml/2006/main">
+                  <a:graphicData uri="http://schemas.microsoft.com/office/word/2010/wordprocessingShape">
+                    <wps:wsp>
+                      <wps:cNvSpPr txBox="1"/>
+                      <wps:spPr>
+                        <a:xfrm>
+                          <a:off x="0" y="0"/>
+                          <a:ext cx="3199130" cy="1196340"/>
+                        </a:xfrm>
+                        <a:prstGeom prst="rect"/>
+                        <a:solidFill>
+                          <a:srgbClr val="FFFFFF"/>
+                        </a:solidFill>
+                      </wps:spPr>
+                      <wps:txbx>
+                        <w:txbxContent>
+                          <w:p>
+                            <w:pPr>
+                              <w:pStyle w:val="Caption"/>
+                              <w:suppressLineNumbers/>
+                              <w:spacing w:before="120" w:after="120"/>
+                              <w:rPr/>
+                            </w:pPr>
+                            <w:r>
+                              <w:rPr/>
+                              <w:drawing>
+                                <wp:inline distT="0" distB="0" distL="0" distR="0">
+                                  <wp:extent cx="3199130" cy="665480"/>
+                                  <wp:effectExtent l="0" t="0" r="0" b="0"/>
+                                  <wp:docPr id="5" name="Image3" descr=""/>
+                                  <wp:cNvGraphicFramePr>
+                                    <a:graphicFrameLocks xmlns:a="http://schemas.openxmlformats.org/drawingml/2006/main" noChangeAspect="1"/>
+                                  </wp:cNvGraphicFramePr>
+                                  <a:graphic xmlns:a="http://schemas.openxmlformats.org/drawingml/2006/main">
+                                    <a:graphicData uri="http://schemas.openxmlformats.org/drawingml/2006/picture">
+                                      <pic:pic xmlns:pic="http://schemas.openxmlformats.org/drawingml/2006/picture">
+                                        <pic:nvPicPr>
+                                          <pic:cNvPr id="5" name="Image3" descr=""/>
+                                          <pic:cNvPicPr>
+                                            <a:picLocks noChangeAspect="1" noChangeArrowheads="1"/>
+                                          </pic:cNvPicPr>
+                                        </pic:nvPicPr>
+                                        <pic:blipFill>
+                                          <a:blip r:embed="rId5"/>
+                                          <a:stretch>
+                                            <a:fillRect/>
+                                          </a:stretch>
+                                        </pic:blipFill>
+                                        <pic:spPr bwMode="auto">
+                                          <a:xfrm>
+                                            <a:off x="0" y="0"/>
+                                            <a:ext cx="3199130" cy="665480"/>
+                                          </a:xfrm>
+                                          <a:prstGeom prst="rect">
+                                            <a:avLst/>
+                                          </a:prstGeom>
+                                        </pic:spPr>
+                                      </pic:pic>
+                                    </a:graphicData>
+                                  </a:graphic>
+                                </wp:inline>
+                              </w:drawing>
+                              <w:t>Current sorting changes to show the currently selected sorting option</w:t>
+                            </w:r>
+                          </w:p>
+                        </w:txbxContent>
+                      </wps:txbx>
+                      <wps:bodyPr anchor="t" lIns="0" tIns="0" rIns="0" bIns="0">
+                        <a:noAutofit/>
+                      </wps:bodyPr>
+                    </wps:wsp>
+                  </a:graphicData>
+                </a:graphic>
+              </wp:anchor>
+            </w:drawing>
+          </mc:Choice>
+          <mc:Fallback>
+            <w:pict>
+              <v:rect style="position:absolute;rotation:-0;width:251.9pt;height:94.2pt;mso-wrap-distance-left:0pt;mso-wrap-distance-right:0pt;mso-wrap-distance-top:0pt;mso-wrap-distance-bottom:0pt;margin-top:2.9pt;mso-position-vertical-relative:text;margin-left:91.15pt;mso-position-horizontal-relative:text">
+                <v:textbox inset="0in,0in,0in,0in">
+                  <w:txbxContent>
+                    <w:p>
+                      <w:pPr>
+                        <w:pStyle w:val="Caption"/>
+                        <w:suppressLineNumbers/>
+                        <w:spacing w:before="120" w:after="120"/>
+                        <w:rPr/>
+                      </w:pPr>
+                      <w:r>
+                        <w:rPr/>
+                        <w:drawing>
+                          <wp:inline distT="0" distB="0" distL="0" distR="0">
+                            <wp:extent cx="3199130" cy="665480"/>
+                            <wp:effectExtent l="0" t="0" r="0" b="0"/>
+                            <wp:docPr id="6" name="Image3" descr=""/>
+                            <wp:cNvGraphicFramePr>
+                              <a:graphicFrameLocks xmlns:a="http://schemas.openxmlformats.org/drawingml/2006/main" noChangeAspect="1"/>
+                            </wp:cNvGraphicFramePr>
+                            <a:graphic xmlns:a="http://schemas.openxmlformats.org/drawingml/2006/main">
+                              <a:graphicData uri="http://schemas.openxmlformats.org/drawingml/2006/picture">
+                                <pic:pic xmlns:pic="http://schemas.openxmlformats.org/drawingml/2006/picture">
+                                  <pic:nvPicPr>
+                                    <pic:cNvPr id="6" name="Image3" descr=""/>
+                                    <pic:cNvPicPr>
+                                      <a:picLocks noChangeAspect="1" noChangeArrowheads="1"/>
+                                    </pic:cNvPicPr>
+                                  </pic:nvPicPr>
+                                  <pic:blipFill>
+                                    <a:blip r:embed="rId6"/>
+                                    <a:stretch>
+                                      <a:fillRect/>
+                                    </a:stretch>
+                                  </pic:blipFill>
+                                  <pic:spPr bwMode="auto">
+                                    <a:xfrm>
+                                      <a:off x="0" y="0"/>
+                                      <a:ext cx="3199130" cy="665480"/>
+                                    </a:xfrm>
+                                    <a:prstGeom prst="rect">
+                                      <a:avLst/>
+                                    </a:prstGeom>
+                                  </pic:spPr>
+                                </pic:pic>
+                              </a:graphicData>
+                            </a:graphic>
+                          </wp:inline>
+                        </w:drawing>
+                        <w:t>Current sorting changes to show the currently selected sorting option</w:t>
+                      </w:r>
+                    </w:p>
+                  </w:txbxContent>
+                </v:textbox>
+                <w10:wrap type="square" side="largest"/>
+              </v:rect>
+            </w:pict>
+          </mc:Fallback>
+        </mc:AlternateContent>
+      </w:r>
+    </w:p>
+    <w:p>
+      <w:pPr>
+        <w:pStyle w:val="Normal"/>
+        <w:rPr/>
+      </w:pPr>
+      <w:r>
+        <w:rPr/>
+      </w:r>
+    </w:p>
+    <w:p>
+      <w:pPr>
+        <w:pStyle w:val="Normal"/>
+        <w:rPr/>
+      </w:pPr>
+      <w:r>
+        <w:rPr/>
+      </w:r>
+    </w:p>
+    <w:p>
+      <w:pPr>
+        <w:pStyle w:val="Normal"/>
+        <w:rPr>
+          <w:u w:val="single"/>
+        </w:rPr>
+      </w:pPr>
+      <w:r>
+        <w:rPr>
+          <w:u w:val="single"/>
+        </w:rPr>
+        <w:br/>
+        <w:br/>
+        <w:br/>
+        <w:t>2.2</w:t>
+      </w:r>
+    </w:p>
+    <w:p>
+      <w:pPr>
+        <w:pStyle w:val="Normal"/>
+        <w:rPr>
+          <w:u w:val="none"/>
+        </w:rPr>
+      </w:pPr>
+      <w:r>
+        <w:rPr>
+          <w:u w:val="none"/>
+        </w:rPr>
+        <w:t>Clear Sorting: users can return back to Highest Points First sorting, by selecting clear all sorting from the sort by options.</w:t>
+      </w:r>
+    </w:p>
+    <w:p>
+      <w:pPr>
+        <w:pStyle w:val="Normal"/>
+        <w:rPr>
+          <w:u w:val="none"/>
+        </w:rPr>
+      </w:pPr>
+      <w:r>
+        <w:rPr>
+          <w:u w:val="none"/>
+        </w:rPr>
+      </w:r>
+    </w:p>
+    <w:p>
+      <w:pPr>
+        <w:pStyle w:val="Normal"/>
+        <w:rPr>
+          <w:u w:val="single"/>
+        </w:rPr>
+      </w:pPr>
+      <w:r>
+        <w:rPr>
+          <w:u w:val="single"/>
+        </w:rPr>
+        <w:t>2.3 – User Position in leaderboard shown in separate section</w:t>
+      </w:r>
+    </w:p>
+    <w:p>
+      <w:pPr>
+        <w:pStyle w:val="Normal"/>
+        <w:rPr>
+          <w:u w:val="single"/>
+        </w:rPr>
+      </w:pPr>
+      <w:r>
+        <w:rPr>
+          <w:u w:val="single"/>
+        </w:rPr>
+      </w:r>
+    </w:p>
+    <w:p>
+      <w:pPr>
+        <w:pStyle w:val="Normal"/>
+        <w:rPr>
+          <w:u w:val="none"/>
+        </w:rPr>
+      </w:pPr>
+      <w:r>
+        <w:rPr>
+          <w:u w:val="none"/>
+        </w:rPr>
+      </w:r>
+    </w:p>
+    <w:p>
+      <w:pPr>
+        <w:pStyle w:val="Normal"/>
+        <w:rPr>
+          <w:u w:val="none"/>
+        </w:rPr>
+      </w:pPr>
+      <w:r>
+        <w:rPr>
+          <w:u w:val="none"/>
+        </w:rPr>
+        <w:br/>
+        <w:br/>
+        <w:t>Users can see their position in the leader board, in a separate section before the full leader board is shown. This helps as if there are many users, it allows users to quickly see their progress, and compare this to others via their position, without having to scroll down for long. For example, if there are 100 users, and user “bob12” is in position 58, they do not have to scroll down a lot, to be able to find their position and see how they are doing relative to others.</w:t>
+      </w:r>
+      <w:r>
+        <mc:AlternateContent>
+          <mc:Choice Requires="wps">
+            <w:drawing>
+              <wp:anchor behindDoc="0" distT="0" distB="0" distL="0" distR="0" simplePos="0" locked="0" layoutInCell="0" allowOverlap="1" relativeHeight="5">
+                <wp:simplePos x="0" y="0"/>
+                <wp:positionH relativeFrom="column">
+                  <wp:align>center</wp:align>
+                </wp:positionH>
+                <wp:positionV relativeFrom="paragraph">
+                  <wp:posOffset>635</wp:posOffset>
+                </wp:positionV>
+                <wp:extent cx="6120130" cy="1800860"/>
+                <wp:effectExtent l="0" t="0" r="0" b="0"/>
+                <wp:wrapSquare wrapText="largest"/>
+                <wp:docPr id="7" name="Frame1"/>
+                <a:graphic xmlns:a="http://schemas.openxmlformats.org/drawingml/2006/main">
+                  <a:graphicData uri="http://schemas.microsoft.com/office/word/2010/wordprocessingShape">
+                    <wps:wsp>
+                      <wps:cNvSpPr txBox="1"/>
+                      <wps:spPr>
+                        <a:xfrm>
+                          <a:off x="0" y="0"/>
+                          <a:ext cx="6120130" cy="1800860"/>
+                        </a:xfrm>
+                        <a:prstGeom prst="rect"/>
+                        <a:solidFill>
+                          <a:srgbClr val="FFFFFF"/>
+                        </a:solidFill>
+                      </wps:spPr>
+                      <wps:txbx>
+                        <w:txbxContent>
+                          <w:p>
+                            <w:pPr>
+                              <w:pStyle w:val="Caption"/>
+                              <w:suppressLineNumbers/>
+                              <w:spacing w:before="120" w:after="120"/>
+                              <w:rPr/>
+                            </w:pPr>
+                            <w:r>
+                              <w:rPr/>
+                              <w:drawing>
+                                <wp:inline distT="0" distB="0" distL="0" distR="0">
+                                  <wp:extent cx="6120130" cy="1558290"/>
+                                  <wp:effectExtent l="0" t="0" r="0" b="0"/>
+                                  <wp:docPr id="8" name="Image2 Copy 1" descr=""/>
+                                  <wp:cNvGraphicFramePr>
+                                    <a:graphicFrameLocks xmlns:a="http://schemas.openxmlformats.org/drawingml/2006/main" noChangeAspect="1"/>
+                                  </wp:cNvGraphicFramePr>
+                                  <a:graphic xmlns:a="http://schemas.openxmlformats.org/drawingml/2006/main">
+                                    <a:graphicData uri="http://schemas.openxmlformats.org/drawingml/2006/picture">
+                                      <pic:pic xmlns:pic="http://schemas.openxmlformats.org/drawingml/2006/picture">
+                                        <pic:nvPicPr>
+                                          <pic:cNvPr id="8" name="Image2 Copy 1" descr=""/>
+                                          <pic:cNvPicPr>
+                                            <a:picLocks noChangeAspect="1" noChangeArrowheads="1"/>
+                                          </pic:cNvPicPr>
+                                        </pic:nvPicPr>
+                                        <pic:blipFill>
+                                          <a:blip r:embed="rId7"/>
+                                          <a:stretch>
+                                            <a:fillRect/>
+                                          </a:stretch>
+                                        </pic:blipFill>
+                                        <pic:spPr bwMode="auto">
+                                          <a:xfrm>
+                                            <a:off x="0" y="0"/>
+                                            <a:ext cx="6120130" cy="1558290"/>
+                                          </a:xfrm>
+                                          <a:prstGeom prst="rect">
+                                            <a:avLst/>
+                                          </a:prstGeom>
+                                        </pic:spPr>
+                                      </pic:pic>
+                                    </a:graphicData>
+                                  </a:graphic>
+                                </wp:inline>
+                              </w:drawing>
+                              <w:t>Users can see their position in a separated section before the full leader board</w:t>
+                            </w:r>
+                          </w:p>
+                        </w:txbxContent>
+                      </wps:txbx>
+                      <wps:bodyPr anchor="t" lIns="0" tIns="0" rIns="0" bIns="0">
+                        <a:noAutofit/>
+                      </wps:bodyPr>
+                    </wps:wsp>
+                  </a:graphicData>
+                </a:graphic>
+              </wp:anchor>
+            </w:drawing>
+          </mc:Choice>
+          <mc:Fallback>
+            <w:pict>
+              <v:rect style="position:absolute;rotation:-0;width:481.9pt;height:141.8pt;mso-wrap-distance-left:0pt;mso-wrap-distance-right:0pt;mso-wrap-distance-top:0pt;mso-wrap-distance-bottom:0pt;margin-top:0pt;mso-position-vertical:top;mso-position-vertical-relative:text;margin-left:-15.3pt;mso-position-horizontal:center;mso-position-horizontal-relative:text">
+                <v:textbox inset="0in,0in,0in,0in">
+                  <w:txbxContent>
+                    <w:p>
+                      <w:pPr>
+                        <w:pStyle w:val="Caption"/>
+                        <w:suppressLineNumbers/>
+                        <w:spacing w:before="120" w:after="120"/>
+                        <w:rPr/>
+                      </w:pPr>
+                      <w:r>
+                        <w:rPr/>
+                        <w:drawing>
+                          <wp:inline distT="0" distB="0" distL="0" distR="0">
+                            <wp:extent cx="6120130" cy="1558290"/>
+                            <wp:effectExtent l="0" t="0" r="0" b="0"/>
+                            <wp:docPr id="9" name="Image2 Copy 1" descr=""/>
+                            <wp:cNvGraphicFramePr>
+                              <a:graphicFrameLocks xmlns:a="http://schemas.openxmlformats.org/drawingml/2006/main" noChangeAspect="1"/>
+                            </wp:cNvGraphicFramePr>
+                            <a:graphic xmlns:a="http://schemas.openxmlformats.org/drawingml/2006/main">
+                              <a:graphicData uri="http://schemas.openxmlformats.org/drawingml/2006/picture">
+                                <pic:pic xmlns:pic="http://schemas.openxmlformats.org/drawingml/2006/picture">
+                                  <pic:nvPicPr>
+                                    <pic:cNvPr id="9" name="Image2 Copy 1" descr=""/>
+                                    <pic:cNvPicPr>
+                                      <a:picLocks noChangeAspect="1" noChangeArrowheads="1"/>
+                                    </pic:cNvPicPr>
+                                  </pic:nvPicPr>
+                                  <pic:blipFill>
+                                    <a:blip r:embed="rId8"/>
+                                    <a:stretch>
+                                      <a:fillRect/>
+                                    </a:stretch>
+                                  </pic:blipFill>
+                                  <pic:spPr bwMode="auto">
+                                    <a:xfrm>
+                                      <a:off x="0" y="0"/>
+                                      <a:ext cx="6120130" cy="1558290"/>
+                                    </a:xfrm>
+                                    <a:prstGeom prst="rect">
+                                      <a:avLst/>
+                                    </a:prstGeom>
+                                  </pic:spPr>
+                                </pic:pic>
+                              </a:graphicData>
+                            </a:graphic>
+                          </wp:inline>
+                        </w:drawing>
+                        <w:t>Users can see their position in a separated section before the full leader board</w:t>
+                      </w:r>
+                    </w:p>
+                  </w:txbxContent>
+                </v:textbox>
+                <w10:wrap type="square" side="largest"/>
+              </v:rect>
+            </w:pict>
+          </mc:Fallback>
+        </mc:AlternateContent>
+      </w:r>
+    </w:p>
+    <w:p>
+      <w:pPr>
+        <w:pStyle w:val="Normal"/>
+        <w:rPr>
+          <w:u w:val="none"/>
+        </w:rPr>
+      </w:pPr>
+      <w:r>
+        <w:rPr>
+          <w:u w:val="none"/>
+        </w:rPr>
+      </w:r>
+    </w:p>
+    <w:p>
+      <w:pPr>
+        <w:pStyle w:val="Normal"/>
+        <w:rPr>
+          <w:u w:val="single"/>
+        </w:rPr>
+      </w:pPr>
+      <w:r>
+        <w:rPr>
+          <w:u w:val="single"/>
+        </w:rPr>
+        <w:t>2.3 – Global Leaderboard</w:t>
+      </w:r>
+    </w:p>
+    <w:p>
+      <w:pPr>
+        <w:pStyle w:val="Normal"/>
+        <w:rPr>
+          <w:u w:val="single"/>
+        </w:rPr>
+      </w:pPr>
+      <w:r>
+        <w:rPr>
+          <w:u w:val="single"/>
+        </w:rPr>
+      </w:r>
+    </w:p>
+    <w:p>
+      <w:pPr>
+        <w:pStyle w:val="Normal"/>
+        <w:rPr>
+          <w:u w:val="none"/>
+        </w:rPr>
+      </w:pPr>
+      <w:r>
+        <w:rPr>
+          <w:u w:val="none"/>
+        </w:rPr>
+        <w:t>Users are then presented with the full leader board, in which every user is shown, along with their position, username, points, number of completed courses, and a button in which users can visit other students’ profiles. The currently logged in student is highlighted green, which can aid in quickly identifying their position on the leaderboard, from which they can compare themselves against those around them.</w:t>
+      </w:r>
+    </w:p>
+    <w:p>
+      <w:pPr>
+        <w:pStyle w:val="Normal"/>
+        <w:rPr>
+          <w:u w:val="none"/>
+        </w:rPr>
+      </w:pPr>
+      <w:r>
+        <w:rPr>
+          <w:u w:val="none"/>
+        </w:rPr>
+      </w:r>
+    </w:p>
+    <w:p>
+      <w:pPr>
+        <w:pStyle w:val="Normal"/>
+        <w:rPr>
+          <w:u w:val="none"/>
+        </w:rPr>
+      </w:pPr>
+      <w:r>
+        <w:rPr>
+          <w:u w:val="none"/>
+        </w:rPr>
+      </w:r>
+    </w:p>
+    <w:p>
+      <w:pPr>
+        <w:pStyle w:val="Normal"/>
+        <w:rPr>
+          <w:u w:val="none"/>
+        </w:rPr>
+      </w:pPr>
+      <w:r>
+        <w:rPr>
+          <w:u w:val="none"/>
+        </w:rPr>
+        <w:drawing>
+          <wp:anchor behindDoc="0" distT="0" distB="0" distL="0" distR="0" simplePos="0" locked="0" layoutInCell="0" allowOverlap="1" relativeHeight="11">
+            <wp:simplePos x="0" y="0"/>
+            <wp:positionH relativeFrom="column">
+              <wp:posOffset>610870</wp:posOffset>
+            </wp:positionH>
+            <wp:positionV relativeFrom="paragraph">
+              <wp:posOffset>3099435</wp:posOffset>
+            </wp:positionV>
+            <wp:extent cx="4108450" cy="810895"/>
+            <wp:effectExtent l="0" t="0" r="0" b="0"/>
+            <wp:wrapSquare wrapText="largest"/>
+            <wp:docPr id="10" name="Image5" descr=""/>
+            <wp:cNvGraphicFramePr>
+              <a:graphicFrameLocks xmlns:a="http://schemas.openxmlformats.org/drawingml/2006/main" noChangeAspect="1"/>
+            </wp:cNvGraphicFramePr>
+            <a:graphic xmlns:a="http://schemas.openxmlformats.org/drawingml/2006/main">
+              <a:graphicData uri="http://schemas.openxmlformats.org/drawingml/2006/picture">
+                <pic:pic xmlns:pic="http://schemas.openxmlformats.org/drawingml/2006/picture">
+                  <pic:nvPicPr>
+                    <pic:cNvPr id="10" name="Image5" descr=""/>
+                    <pic:cNvPicPr>
+                      <a:picLocks noChangeAspect="1" noChangeArrowheads="1"/>
+                    </pic:cNvPicPr>
+                  </pic:nvPicPr>
+                  <pic:blipFill>
+                    <a:blip r:embed="rId9"/>
+                    <a:stretch>
+                      <a:fillRect/>
+                    </a:stretch>
+                  </pic:blipFill>
+                  <pic:spPr bwMode="auto">
+                    <a:xfrm>
+                      <a:off x="0" y="0"/>
+                      <a:ext cx="4108450" cy="810895"/>
+                    </a:xfrm>
+                    <a:prstGeom prst="rect">
+                      <a:avLst/>
+                    </a:prstGeom>
+                  </pic:spPr>
+                </pic:pic>
+              </a:graphicData>
+            </a:graphic>
+          </wp:anchor>
+        </w:drawing>
+        <w:br/>
+        <w:br/>
+        <w:br/>
+        <w:br/>
+        <w:br/>
+        <w:br/>
+        <w:br/>
+        <w:br/>
+        <w:br/>
+        <w:br/>
+        <w:br/>
+      </w:r>
+      <w:r>
+        <w:br w:type="page"/>
+      </w:r>
+      <w:r>
+        <mc:AlternateContent>
+          <mc:Choice Requires="wps">
+            <w:drawing>
+              <wp:anchor behindDoc="0" distT="0" distB="0" distL="0" distR="0" simplePos="0" locked="0" layoutInCell="0" allowOverlap="1" relativeHeight="9">
+                <wp:simplePos x="0" y="0"/>
+                <wp:positionH relativeFrom="column">
+                  <wp:align>center</wp:align>
+                </wp:positionH>
+                <wp:positionV relativeFrom="paragraph">
+                  <wp:posOffset>635</wp:posOffset>
+                </wp:positionV>
+                <wp:extent cx="6120130" cy="2304415"/>
+                <wp:effectExtent l="0" t="0" r="0" b="0"/>
+                <wp:wrapSquare wrapText="largest"/>
+                <wp:docPr id="11" name="Frame3"/>
+                <a:graphic xmlns:a="http://schemas.openxmlformats.org/drawingml/2006/main">
+                  <a:graphicData uri="http://schemas.microsoft.com/office/word/2010/wordprocessingShape">
+                    <wps:wsp>
+                      <wps:cNvSpPr txBox="1"/>
+                      <wps:spPr>
+                        <a:xfrm>
+                          <a:off x="0" y="0"/>
+                          <a:ext cx="6120130" cy="2304415"/>
+                        </a:xfrm>
+                        <a:prstGeom prst="rect"/>
+                        <a:solidFill>
+                          <a:srgbClr val="FFFFFF"/>
+                        </a:solidFill>
+                      </wps:spPr>
+                      <wps:txbx>
+                        <w:txbxContent>
+                          <w:p>
+                            <w:pPr>
+                              <w:pStyle w:val="Caption"/>
+                              <w:suppressLineNumbers/>
+                              <w:spacing w:before="120" w:after="120"/>
+                              <w:rPr/>
+                            </w:pPr>
+                            <w:r>
+                              <w:rPr/>
+                              <w:drawing>
+                                <wp:inline distT="0" distB="0" distL="0" distR="0">
+                                  <wp:extent cx="6120130" cy="2096135"/>
+                                  <wp:effectExtent l="0" t="0" r="0" b="0"/>
+                                  <wp:docPr id="12" name="Image4" descr=""/>
+                                  <wp:cNvGraphicFramePr>
+                                    <a:graphicFrameLocks xmlns:a="http://schemas.openxmlformats.org/drawingml/2006/main" noChangeAspect="1"/>
+                                  </wp:cNvGraphicFramePr>
+                                  <a:graphic xmlns:a="http://schemas.openxmlformats.org/drawingml/2006/main">
+                                    <a:graphicData uri="http://schemas.openxmlformats.org/drawingml/2006/picture">
+                                      <pic:pic xmlns:pic="http://schemas.openxmlformats.org/drawingml/2006/picture">
+                                        <pic:nvPicPr>
+                                          <pic:cNvPr id="12" name="Image4" descr=""/>
+                                          <pic:cNvPicPr>
+                                            <a:picLocks noChangeAspect="1" noChangeArrowheads="1"/>
+                                          </pic:cNvPicPr>
+                                        </pic:nvPicPr>
+                                        <pic:blipFill>
+                                          <a:blip r:embed="rId10"/>
+                                          <a:stretch>
+                                            <a:fillRect/>
+                                          </a:stretch>
+                                        </pic:blipFill>
+                                        <pic:spPr bwMode="auto">
+                                          <a:xfrm>
+                                            <a:off x="0" y="0"/>
+                                            <a:ext cx="6120130" cy="2096135"/>
+                                          </a:xfrm>
+                                          <a:prstGeom prst="rect">
+                                            <a:avLst/>
+                                          </a:prstGeom>
+                                        </pic:spPr>
+                                      </pic:pic>
+                                    </a:graphicData>
+                                  </a:graphic>
+                                </wp:inline>
+                              </w:drawing>
+                              <w:t>Users can see the full leaderboard, and they are highlighted in green, to help visual recognition</w:t>
+                            </w:r>
+                          </w:p>
+                        </w:txbxContent>
+                      </wps:txbx>
+                      <wps:bodyPr anchor="t" lIns="0" tIns="0" rIns="0" bIns="0">
+                        <a:noAutofit/>
+                      </wps:bodyPr>
+                    </wps:wsp>
+                  </a:graphicData>
+                </a:graphic>
+              </wp:anchor>
+            </w:drawing>
+          </mc:Choice>
+          <mc:Fallback>
+            <w:pict>
+              <v:rect style="position:absolute;rotation:-0;width:481.9pt;height:181.45pt;mso-wrap-distance-left:0pt;mso-wrap-distance-right:0pt;mso-wrap-distance-top:0pt;mso-wrap-distance-bottom:0pt;margin-top:0pt;mso-position-vertical:top;mso-position-vertical-relative:text;margin-left:-15.3pt;mso-position-horizontal:center;mso-position-horizontal-relative:text">
+                <v:textbox inset="0in,0in,0in,0in">
+                  <w:txbxContent>
+                    <w:p>
+                      <w:pPr>
+                        <w:pStyle w:val="Caption"/>
+                        <w:suppressLineNumbers/>
+                        <w:spacing w:before="120" w:after="120"/>
+                        <w:rPr/>
+                      </w:pPr>
+                      <w:r>
+                        <w:rPr/>
+                        <w:drawing>
+                          <wp:inline distT="0" distB="0" distL="0" distR="0">
+                            <wp:extent cx="6120130" cy="2096135"/>
+                            <wp:effectExtent l="0" t="0" r="0" b="0"/>
+                            <wp:docPr id="13" name="Image4" descr=""/>
+                            <wp:cNvGraphicFramePr>
+                              <a:graphicFrameLocks xmlns:a="http://schemas.openxmlformats.org/drawingml/2006/main" noChangeAspect="1"/>
+                            </wp:cNvGraphicFramePr>
+                            <a:graphic xmlns:a="http://schemas.openxmlformats.org/drawingml/2006/main">
+                              <a:graphicData uri="http://schemas.openxmlformats.org/drawingml/2006/picture">
+                                <pic:pic xmlns:pic="http://schemas.openxmlformats.org/drawingml/2006/picture">
+                                  <pic:nvPicPr>
+                                    <pic:cNvPr id="13" name="Image4" descr=""/>
+                                    <pic:cNvPicPr>
+                                      <a:picLocks noChangeAspect="1" noChangeArrowheads="1"/>
+                                    </pic:cNvPicPr>
+                                  </pic:nvPicPr>
+                                  <pic:blipFill>
+                                    <a:blip r:embed="rId11"/>
+                                    <a:stretch>
+                                      <a:fillRect/>
+                                    </a:stretch>
+                                  </pic:blipFill>
+                                  <pic:spPr bwMode="auto">
+                                    <a:xfrm>
+                                      <a:off x="0" y="0"/>
+                                      <a:ext cx="6120130" cy="2096135"/>
+                                    </a:xfrm>
+                                    <a:prstGeom prst="rect">
+                                      <a:avLst/>
+                                    </a:prstGeom>
+                                  </pic:spPr>
+                                </pic:pic>
+                              </a:graphicData>
+                            </a:graphic>
+                          </wp:inline>
+                        </w:drawing>
+                        <w:t>Users can see the full leaderboard, and they are highlighted in green, to help visual recognition</w:t>
+                      </w:r>
+                    </w:p>
+                  </w:txbxContent>
+                </v:textbox>
+                <w10:wrap type="square" side="largest"/>
+              </v:rect>
+            </w:pict>
+          </mc:Fallback>
+        </mc:AlternateContent>
+      </w:r>
+      <w:r>
+        <mc:AlternateContent>
+          <mc:Choice Requires="wps">
+            <w:drawing>
+              <wp:anchor behindDoc="0" distT="0" distB="0" distL="0" distR="0" simplePos="0" locked="0" layoutInCell="0" allowOverlap="1" relativeHeight="12">
+                <wp:simplePos x="0" y="0"/>
+                <wp:positionH relativeFrom="column">
+                  <wp:posOffset>-340995</wp:posOffset>
+                </wp:positionH>
+                <wp:positionV relativeFrom="paragraph">
+                  <wp:posOffset>3833495</wp:posOffset>
+                </wp:positionV>
+                <wp:extent cx="6120130" cy="2506345"/>
+                <wp:effectExtent l="0" t="0" r="0" b="0"/>
+                <wp:wrapSquare wrapText="largest"/>
+                <wp:docPr id="14" name="Frame4"/>
+                <a:graphic xmlns:a="http://schemas.openxmlformats.org/drawingml/2006/main">
+                  <a:graphicData uri="http://schemas.microsoft.com/office/word/2010/wordprocessingShape">
+                    <wps:wsp>
+                      <wps:cNvSpPr txBox="1"/>
+                      <wps:spPr>
+                        <a:xfrm>
+                          <a:off x="0" y="0"/>
+                          <a:ext cx="6120130" cy="2506345"/>
+                        </a:xfrm>
+                        <a:prstGeom prst="rect"/>
+                        <a:solidFill>
+                          <a:srgbClr val="FFFFFF"/>
+                        </a:solidFill>
+                      </wps:spPr>
+                      <wps:txbx>
+                        <w:txbxContent>
+                          <w:p>
+                            <w:pPr>
+                              <w:pStyle w:val="Caption"/>
+                              <w:suppressLineNumbers/>
+                              <w:spacing w:before="120" w:after="120"/>
+                              <w:rPr/>
+                            </w:pPr>
+                            <w:r>
+                              <w:rPr/>
+                              <w:drawing>
+                                <wp:inline distT="0" distB="0" distL="0" distR="0">
+                                  <wp:extent cx="6120130" cy="2109470"/>
+                                  <wp:effectExtent l="0" t="0" r="0" b="0"/>
+                                  <wp:docPr id="15" name="Image6" descr=""/>
+                                  <wp:cNvGraphicFramePr>
+                                    <a:graphicFrameLocks xmlns:a="http://schemas.openxmlformats.org/drawingml/2006/main" noChangeAspect="1"/>
+                                  </wp:cNvGraphicFramePr>
+                                  <a:graphic xmlns:a="http://schemas.openxmlformats.org/drawingml/2006/main">
+                                    <a:graphicData uri="http://schemas.openxmlformats.org/drawingml/2006/picture">
+                                      <pic:pic xmlns:pic="http://schemas.openxmlformats.org/drawingml/2006/picture">
+                                        <pic:nvPicPr>
+                                          <pic:cNvPr id="15" name="Image6" descr=""/>
+                                          <pic:cNvPicPr>
+                                            <a:picLocks noChangeAspect="1" noChangeArrowheads="1"/>
+                                          </pic:cNvPicPr>
+                                        </pic:nvPicPr>
+                                        <pic:blipFill>
+                                          <a:blip r:embed="rId12"/>
+                                          <a:stretch>
+                                            <a:fillRect/>
+                                          </a:stretch>
+                                        </pic:blipFill>
+                                        <pic:spPr bwMode="auto">
+                                          <a:xfrm>
+                                            <a:off x="0" y="0"/>
+                                            <a:ext cx="6120130" cy="2109470"/>
+                                          </a:xfrm>
+                                          <a:prstGeom prst="rect">
+                                            <a:avLst/>
+                                          </a:prstGeom>
+                                        </pic:spPr>
+                                      </pic:pic>
+                                    </a:graphicData>
+                                  </a:graphic>
+                                </wp:inline>
+                              </w:drawing>
+                              <w:t>Pressing view profile on the leaderboard will allow students to see the profile of the selected student</w:t>
+                            </w:r>
+                          </w:p>
+                        </w:txbxContent>
+                      </wps:txbx>
+                      <wps:bodyPr anchor="t" lIns="0" tIns="0" rIns="0" bIns="0">
+                        <a:noAutofit/>
+                      </wps:bodyPr>
+                    </wps:wsp>
+                  </a:graphicData>
+                </a:graphic>
+              </wp:anchor>
+            </w:drawing>
+          </mc:Choice>
+          <mc:Fallback>
+            <w:pict>
+              <v:rect style="position:absolute;rotation:-0;width:481.9pt;height:197.35pt;mso-wrap-distance-left:0pt;mso-wrap-distance-right:0pt;mso-wrap-distance-top:0pt;mso-wrap-distance-bottom:0pt;margin-top:301.85pt;mso-position-vertical-relative:text;margin-left:-26.85pt;mso-position-horizontal-relative:text">
+                <v:textbox inset="0in,0in,0in,0in">
+                  <w:txbxContent>
+                    <w:p>
+                      <w:pPr>
+                        <w:pStyle w:val="Caption"/>
+                        <w:suppressLineNumbers/>
+                        <w:spacing w:before="120" w:after="120"/>
+                        <w:rPr/>
+                      </w:pPr>
+                      <w:r>
+                        <w:rPr/>
+                        <w:drawing>
+                          <wp:inline distT="0" distB="0" distL="0" distR="0">
+                            <wp:extent cx="6120130" cy="2109470"/>
+                            <wp:effectExtent l="0" t="0" r="0" b="0"/>
+                            <wp:docPr id="16" name="Image6" descr=""/>
+                            <wp:cNvGraphicFramePr>
+                              <a:graphicFrameLocks xmlns:a="http://schemas.openxmlformats.org/drawingml/2006/main" noChangeAspect="1"/>
+                            </wp:cNvGraphicFramePr>
+                            <a:graphic xmlns:a="http://schemas.openxmlformats.org/drawingml/2006/main">
+                              <a:graphicData uri="http://schemas.openxmlformats.org/drawingml/2006/picture">
+                                <pic:pic xmlns:pic="http://schemas.openxmlformats.org/drawingml/2006/picture">
+                                  <pic:nvPicPr>
+                                    <pic:cNvPr id="16" name="Image6" descr=""/>
+                                    <pic:cNvPicPr>
+                                      <a:picLocks noChangeAspect="1" noChangeArrowheads="1"/>
+                                    </pic:cNvPicPr>
+                                  </pic:nvPicPr>
+                                  <pic:blipFill>
+                                    <a:blip r:embed="rId13"/>
+                                    <a:stretch>
+                                      <a:fillRect/>
+                                    </a:stretch>
+                                  </pic:blipFill>
+                                  <pic:spPr bwMode="auto">
+                                    <a:xfrm>
+                                      <a:off x="0" y="0"/>
+                                      <a:ext cx="6120130" cy="2109470"/>
+                                    </a:xfrm>
+                                    <a:prstGeom prst="rect">
+                                      <a:avLst/>
+                                    </a:prstGeom>
+                                  </pic:spPr>
+                                </pic:pic>
+                              </a:graphicData>
+                            </a:graphic>
+                          </wp:inline>
+                        </w:drawing>
+                        <w:t>Pressing view profile on the leaderboard will allow students to see the profile of the selected student</w:t>
+                      </w:r>
+                    </w:p>
+                  </w:txbxContent>
+                </v:textbox>
+                <w10:wrap type="square" side="largest"/>
+              </v:rect>
+            </w:pict>
+          </mc:Fallback>
+        </mc:AlternateContent>
+      </w:r>
+    </w:p>
+    <w:p>
+      <w:pPr>
+        <w:pStyle w:val="Normal"/>
+        <w:rPr>
+          <w:u w:val="none"/>
+        </w:rPr>
+      </w:pPr>
+      <w:r>
+        <w:rPr>
+          <w:u w:val="single"/>
+        </w:rPr>
+        <w:t>2.4 Joint Positions</w:t>
+        <w:br/>
+        <w:br/>
+      </w:r>
+      <w:r>
+        <w:rPr>
+          <w:u w:val="none"/>
+        </w:rPr>
+        <w:t>In order to ensure fairness, students will notice that the leader board utilizes joint positions. This was a design choice to ensure users positions accurately represent their performance, in terms of points and the number of courses completed, and allows for better comparisons against other students.</w:t>
+      </w:r>
+    </w:p>
+    <w:p>
+      <w:pPr>
+        <w:pStyle w:val="Normal"/>
+        <w:rPr>
+          <w:u w:val="none"/>
+        </w:rPr>
+      </w:pPr>
+      <w:r>
+        <w:rPr>
+          <w:u w:val="none"/>
+        </w:rPr>
+      </w:r>
+    </w:p>
+    <w:p>
+      <w:pPr>
+        <w:pStyle w:val="Normal"/>
+        <w:rPr>
+          <w:u w:val="none"/>
+        </w:rPr>
+      </w:pPr>
+      <w:r>
+        <w:rPr>
+          <w:u w:val="none"/>
+        </w:rPr>
+      </w:r>
+    </w:p>
+    <w:p>
+      <w:pPr>
+        <w:pStyle w:val="Normal"/>
+        <w:rPr>
+          <w:u w:val="none"/>
+        </w:rPr>
+      </w:pPr>
+      <w:r>
+        <w:rPr>
+          <w:u w:val="single"/>
+        </w:rPr>
+        <w:br/>
+        <w:t>2.5 Back To Dashboard</w:t>
+      </w:r>
+      <w:r>
+        <mc:AlternateContent>
+          <mc:Choice Requires="wps">
+            <w:drawing>
+              <wp:anchor behindDoc="0" distT="0" distB="0" distL="0" distR="0" simplePos="0" locked="0" layoutInCell="0" allowOverlap="1" relativeHeight="14">
+                <wp:simplePos x="0" y="0"/>
+                <wp:positionH relativeFrom="column">
+                  <wp:align>center</wp:align>
+                </wp:positionH>
+                <wp:positionV relativeFrom="paragraph">
+                  <wp:posOffset>635</wp:posOffset>
+                </wp:positionV>
+                <wp:extent cx="6120130" cy="2564765"/>
+                <wp:effectExtent l="0" t="0" r="0" b="0"/>
+                <wp:wrapSquare wrapText="largest"/>
+                <wp:docPr id="17" name="Frame5"/>
+                <a:graphic xmlns:a="http://schemas.openxmlformats.org/drawingml/2006/main">
+                  <a:graphicData uri="http://schemas.microsoft.com/office/word/2010/wordprocessingShape">
+                    <wps:wsp>
+                      <wps:cNvSpPr txBox="1"/>
+                      <wps:spPr>
+                        <a:xfrm>
+                          <a:off x="0" y="0"/>
+                          <a:ext cx="6120130" cy="2564765"/>
+                        </a:xfrm>
+                        <a:prstGeom prst="rect"/>
+                        <a:solidFill>
+                          <a:srgbClr val="FFFFFF"/>
+                        </a:solidFill>
+                      </wps:spPr>
+                      <wps:txbx>
+                        <w:txbxContent>
+                          <w:p>
+                            <w:pPr>
+                              <w:pStyle w:val="Caption"/>
+                              <w:suppressLineNumbers/>
+                              <w:spacing w:before="120" w:after="120"/>
+                              <w:rPr/>
+                            </w:pPr>
+                            <w:r>
+                              <w:rPr/>
+                              <w:drawing>
+                                <wp:inline distT="0" distB="0" distL="0" distR="0">
+                                  <wp:extent cx="6120130" cy="2172335"/>
+                                  <wp:effectExtent l="0" t="0" r="0" b="0"/>
+                                  <wp:docPr id="18" name="Image7" descr=""/>
+                                  <wp:cNvGraphicFramePr>
+                                    <a:graphicFrameLocks xmlns:a="http://schemas.openxmlformats.org/drawingml/2006/main" noChangeAspect="1"/>
+                                  </wp:cNvGraphicFramePr>
+                                  <a:graphic xmlns:a="http://schemas.openxmlformats.org/drawingml/2006/main">
+                                    <a:graphicData uri="http://schemas.openxmlformats.org/drawingml/2006/picture">
+                                      <pic:pic xmlns:pic="http://schemas.openxmlformats.org/drawingml/2006/picture">
+                                        <pic:nvPicPr>
+                                          <pic:cNvPr id="18" name="Image7" descr=""/>
+                                          <pic:cNvPicPr>
+                                            <a:picLocks noChangeAspect="1" noChangeArrowheads="1"/>
+                                          </pic:cNvPicPr>
+                                        </pic:nvPicPr>
+                                        <pic:blipFill>
+                                          <a:blip r:embed="rId14"/>
+                                          <a:stretch>
+                                            <a:fillRect/>
+                                          </a:stretch>
+                                        </pic:blipFill>
+                                        <pic:spPr bwMode="auto">
+                                          <a:xfrm>
+                                            <a:off x="0" y="0"/>
+                                            <a:ext cx="6120130" cy="2172335"/>
+                                          </a:xfrm>
+                                          <a:prstGeom prst="rect">
+                                            <a:avLst/>
+                                          </a:prstGeom>
+                                        </pic:spPr>
+                                      </pic:pic>
+                                    </a:graphicData>
+                                  </a:graphic>
+                                </wp:inline>
+                              </w:drawing>
+                              <w:t>The global leaderboard updates, and shows joint positions for users that have the same number of positions</w:t>
+                            </w:r>
+                          </w:p>
+                        </w:txbxContent>
+                      </wps:txbx>
+                      <wps:bodyPr anchor="t" lIns="0" tIns="0" rIns="0" bIns="0">
+                        <a:noAutofit/>
+                      </wps:bodyPr>
+                    </wps:wsp>
+                  </a:graphicData>
+                </a:graphic>
+              </wp:anchor>
+            </w:drawing>
+          </mc:Choice>
+          <mc:Fallback>
+            <w:pict>
+              <v:rect style="position:absolute;rotation:-0;width:481.9pt;height:201.95pt;mso-wrap-distance-left:0pt;mso-wrap-distance-right:0pt;mso-wrap-distance-top:0pt;mso-wrap-distance-bottom:0pt;margin-top:0pt;mso-position-vertical:top;mso-position-vertical-relative:text;margin-left:-15.3pt;mso-position-horizontal:center;mso-position-horizontal-relative:text">
+                <v:textbox inset="0in,0in,0in,0in">
+                  <w:txbxContent>
+                    <w:p>
+                      <w:pPr>
+                        <w:pStyle w:val="Caption"/>
+                        <w:suppressLineNumbers/>
+                        <w:spacing w:before="120" w:after="120"/>
+                        <w:rPr/>
+                      </w:pPr>
+                      <w:r>
+                        <w:rPr/>
+                        <w:drawing>
+                          <wp:inline distT="0" distB="0" distL="0" distR="0">
+                            <wp:extent cx="6120130" cy="2172335"/>
+                            <wp:effectExtent l="0" t="0" r="0" b="0"/>
+                            <wp:docPr id="19" name="Image7" descr=""/>
+                            <wp:cNvGraphicFramePr>
+                              <a:graphicFrameLocks xmlns:a="http://schemas.openxmlformats.org/drawingml/2006/main" noChangeAspect="1"/>
+                            </wp:cNvGraphicFramePr>
+                            <a:graphic xmlns:a="http://schemas.openxmlformats.org/drawingml/2006/main">
+                              <a:graphicData uri="http://schemas.openxmlformats.org/drawingml/2006/picture">
+                                <pic:pic xmlns:pic="http://schemas.openxmlformats.org/drawingml/2006/picture">
+                                  <pic:nvPicPr>
+                                    <pic:cNvPr id="19" name="Image7" descr=""/>
+                                    <pic:cNvPicPr>
+                                      <a:picLocks noChangeAspect="1" noChangeArrowheads="1"/>
+                                    </pic:cNvPicPr>
+                                  </pic:nvPicPr>
+                                  <pic:blipFill>
+                                    <a:blip r:embed="rId15"/>
+                                    <a:stretch>
+                                      <a:fillRect/>
+                                    </a:stretch>
+                                  </pic:blipFill>
+                                  <pic:spPr bwMode="auto">
+                                    <a:xfrm>
+                                      <a:off x="0" y="0"/>
+                                      <a:ext cx="6120130" cy="2172335"/>
+                                    </a:xfrm>
+                                    <a:prstGeom prst="rect">
+                                      <a:avLst/>
+                                    </a:prstGeom>
+                                  </pic:spPr>
+                                </pic:pic>
+                              </a:graphicData>
+                            </a:graphic>
+                          </wp:inline>
+                        </w:drawing>
+                        <w:t>The global leaderboard updates, and shows joint positions for users that have the same number of positions</w:t>
+                      </w:r>
+                    </w:p>
+                  </w:txbxContent>
+                </v:textbox>
+                <w10:wrap type="square" side="largest"/>
+              </v:rect>
+            </w:pict>
+          </mc:Fallback>
+        </mc:AlternateContent>
+      </w:r>
+    </w:p>
+    <w:p>
+      <w:pPr>
+        <w:pStyle w:val="Normal"/>
+        <w:rPr>
+          <w:u w:val="single"/>
+        </w:rPr>
+      </w:pPr>
+      <w:r>
+        <w:rPr>
+          <w:u w:val="none"/>
+        </w:rPr>
+      </w:r>
+    </w:p>
+    <w:p>
+      <w:pPr>
+        <w:pStyle w:val="Normal"/>
+        <w:rPr>
+          <w:u w:val="none"/>
+        </w:rPr>
+      </w:pPr>
+      <w:r>
+        <w:rPr>
+          <w:u w:val="none"/>
+        </w:rPr>
+        <w:t>The leader board page has a “Back to Dashboard” button located at the bottom of the page, which students can press to return back to the dashboard page.</w:t>
+      </w:r>
+      <w:r>
+        <w:rPr>
+          <w:u w:val="single"/>
+        </w:rPr>
+        <w:br/>
       </w:r>
     </w:p>
     <w:p>
@@ -2239,6 +3467,7 @@
     <w:qFormat/>
     <w:pPr>
       <w:widowControl/>
+      <w:suppressAutoHyphens w:val="true"/>
       <w:bidi w:val="0"/>
       <w:spacing w:lineRule="auto" w:line="259" w:before="0" w:after="160"/>
       <w:jc w:val="left"/>

</xml_diff>

<commit_message>
Added screenshots to User profile and badges manual information
</commit_message>
<xml_diff>
--- a/IBM_SkillsBuild_Gamification_User_Manual.docx
+++ b/IBM_SkillsBuild_Gamification_User_Manual.docx
@@ -127,10 +127,7 @@
       </w:r>
       <w:proofErr w:type="spellEnd"/>
       <w:r>
-        <w:t xml:space="preserve"> and levelling system. It allows users to track their progress and encourages </w:t>
-      </w:r>
-      <w:r>
-        <w:t xml:space="preserve">participation through a competitive learning environment. The software aims to make online learning more interactive and rewarding, focusing on students using IBM </w:t>
+        <w:t xml:space="preserve"> and levelling system. It allows users to track their progress and encourages participation through a competitive learning environment. The software aims to make online learning more interactive and rewarding, focusing on students using IBM </w:t>
       </w:r>
       <w:proofErr w:type="spellStart"/>
       <w:r>
@@ -143,10 +140,7 @@
     </w:p>
     <w:p>
       <w:r>
-        <w:t>This manual provides guidance on how t</w:t>
-      </w:r>
-      <w:r>
-        <w:t>o install, navigate, and use all available features of the software.</w:t>
+        <w:t>This manual provides guidance on how to install, navigate, and use all available features of the software.</w:t>
       </w:r>
     </w:p>
     <w:p/>
@@ -196,10 +190,7 @@
       </w:r>
       <w:proofErr w:type="spellEnd"/>
       <w:r>
-        <w:t xml:space="preserve"> and U</w:t>
-      </w:r>
-      <w:r>
-        <w:t>ser Profile. It provides an easy-to-use layout for selecting courses and updating learning progress.</w:t>
+        <w:t xml:space="preserve"> and User Profile. It provides an easy-to-use layout for selecting courses and updating learning progress.</w:t>
       </w:r>
     </w:p>
     <w:p>
@@ -303,10 +294,7 @@
         </w:numPr>
       </w:pPr>
       <w:r>
-        <w:t>The dashboard displays multiple courses in in</w:t>
-      </w:r>
-      <w:r>
-        <w:t>dividual grey boxes, each representing a different learning module.</w:t>
+        <w:t>The dashboard displays multiple courses in individual grey boxes, each representing a different learning module.</w:t>
       </w:r>
     </w:p>
     <w:p>
@@ -421,10 +409,7 @@
       </w:r>
       <w:proofErr w:type="spellEnd"/>
       <w:r>
-        <w:t xml:space="preserve">, where they can </w:t>
-      </w:r>
-      <w:r>
-        <w:t>see rankings based on progress and achievements.</w:t>
+        <w:t>, where they can see rankings based on progress and achievements.</w:t>
       </w:r>
     </w:p>
     <w:p>
@@ -463,13 +448,7 @@
         <w:rPr>
           <w:u w:val="single"/>
         </w:rPr>
-        <w:t xml:space="preserve"> </w:t>
-      </w:r>
-      <w:r>
-        <w:rPr>
-          <w:u w:val="single"/>
-        </w:rPr>
-        <w:t>Course Status Page</w:t>
+        <w:t xml:space="preserve"> Course Status Page</w:t>
       </w:r>
     </w:p>
     <w:p>
@@ -560,10 +539,7 @@
       </w:r>
       <w:proofErr w:type="spellEnd"/>
       <w:r>
-        <w:t>") is displayed at the top to indicate the current course being update</w:t>
-      </w:r>
-      <w:r>
-        <w:t>d.</w:t>
+        <w:t>") is displayed at the top to indicate the current course being updated.</w:t>
       </w:r>
     </w:p>
     <w:p>
@@ -633,10 +609,7 @@
     </w:p>
     <w:p>
       <w:r>
-        <w:t>Save Status Butto</w:t>
-      </w:r>
-      <w:r>
-        <w:t>n:</w:t>
+        <w:t>Save Status Button:</w:t>
       </w:r>
     </w:p>
     <w:p>
@@ -669,10 +642,7 @@
     </w:p>
     <w:p>
       <w:r>
-        <w:t xml:space="preserve">The leader board is a way for students to see all students, ranked in order of the number of points they scored, from highest to lowest. This </w:t>
-      </w:r>
-      <w:r>
-        <w:t>allows students to compare progress, and it may motivate them to complete more courses, to climb the leader board, and see their name at the very top!</w:t>
+        <w:t>The leader board is a way for students to see all students, ranked in order of the number of points they scored, from highest to lowest. This allows students to compare progress, and it may motivate them to complete more courses, to climb the leader board, and see their name at the very top!</w:t>
       </w:r>
     </w:p>
     <w:p>
@@ -749,10 +719,7 @@
       </w:r>
       <w:proofErr w:type="spellEnd"/>
       <w:r>
-        <w:t xml:space="preserve"> button on the dashboa</w:t>
-      </w:r>
-      <w:r>
-        <w:t xml:space="preserve">rd page, where they will see some information about sorting the </w:t>
+        <w:t xml:space="preserve"> button on the dashboard page, where they will see some information about sorting the </w:t>
       </w:r>
       <w:proofErr w:type="spellStart"/>
       <w:r>
@@ -768,10 +735,7 @@
       </w:r>
       <w:proofErr w:type="spellEnd"/>
       <w:r>
-        <w:t>, for example, sorting by lowest points first, sorting alphabetically (usernames A – Z) or sorting by the number of courses</w:t>
-      </w:r>
-      <w:r>
-        <w:t xml:space="preserve"> completed.</w:t>
+        <w:t>, for example, sorting by lowest points first, sorting alphabetically (usernames A – Z) or sorting by the number of courses completed.</w:t>
       </w:r>
     </w:p>
     <w:p/>
@@ -868,10 +832,7 @@
                               </w:drawing>
                             </w:r>
                             <w:r>
-                              <w:t xml:space="preserve">Current </w:t>
-                            </w:r>
-                            <w:r>
-                              <w:t>sorting changes to show the currently selected sorting option</w:t>
+                              <w:t>Current sorting changes to show the currently selected sorting option</w:t>
                             </w:r>
                           </w:p>
                         </w:txbxContent>
@@ -942,10 +903,7 @@
                         </w:drawing>
                       </w:r>
                       <w:r>
-                        <w:t xml:space="preserve">Current </w:t>
-                      </w:r>
-                      <w:r>
-                        <w:t>sorting changes to show the currently selected sorting option</w:t>
+                        <w:t>Current sorting changes to show the currently selected sorting option</w:t>
                       </w:r>
                     </w:p>
                   </w:txbxContent>
@@ -1015,20 +973,14 @@
         <w:rPr>
           <w:u w:val="single"/>
         </w:rPr>
-        <w:t xml:space="preserve"> shown in separate sec</w:t>
-      </w:r>
-      <w:r>
+        <w:t xml:space="preserve"> shown in separate section</w:t>
+      </w:r>
+    </w:p>
+    <w:p>
+      <w:pPr>
         <w:rPr>
           <w:u w:val="single"/>
         </w:rPr>
-        <w:t>tion</w:t>
-      </w:r>
-    </w:p>
-    <w:p>
-      <w:pPr>
-        <w:rPr>
-          <w:u w:val="single"/>
-        </w:rPr>
       </w:pPr>
     </w:p>
     <w:p/>
@@ -1038,10 +990,7 @@
       </w:r>
       <w:r>
         <w:br/>
-        <w:t>Users can see their position in the leader board, in a separate section before the full leader board is shown. This helps as if there are many users, it allows users to quickly see their progress, and compare this to others via their position, wit</w:t>
-      </w:r>
-      <w:r>
-        <w:t>hout having to scroll down for long. For example, if there are 100 users, and user “bob12” is in position 58, they do not have to scroll down a lot, to be able to find their position and see how they are doing relative to others.</w:t>
+        <w:t>Users can see their position in the leader board, in a separate section before the full leader board is shown. This helps as if there are many users, it allows users to quickly see their progress, and compare this to others via their position, without having to scroll down for long. For example, if there are 100 users, and user “bob12” is in position 58, they do not have to scroll down a lot, to be able to find their position and see how they are doing relative to others.</w:t>
       </w:r>
       <w:r>
         <w:rPr>
@@ -1130,10 +1079,7 @@
                               </w:drawing>
                             </w:r>
                             <w:r>
-                              <w:t>Users can see their pos</w:t>
-                            </w:r>
-                            <w:r>
-                              <w:t>ition in a separated section before the full leader board</w:t>
+                              <w:t>Users can see their position in a separated section before the full leader board</w:t>
                             </w:r>
                           </w:p>
                         </w:txbxContent>
@@ -1200,10 +1146,7 @@
                         </w:drawing>
                       </w:r>
                       <w:r>
-                        <w:t>Users can see their pos</w:t>
-                      </w:r>
-                      <w:r>
-                        <w:t>ition in a separated section before the full leader board</w:t>
+                        <w:t>Users can see their position in a separated section before the full leader board</w:t>
                       </w:r>
                     </w:p>
                   </w:txbxContent>
@@ -1246,10 +1189,7 @@
     </w:p>
     <w:p>
       <w:r>
-        <w:t xml:space="preserve">Users are then presented with the full leader board, in which every user is shown, along with their position, username, points, number of completed courses, and a button </w:t>
-      </w:r>
-      <w:r>
-        <w:t xml:space="preserve">in which users can visit other students’ profiles. The currently logged in student is highlighted green, which can aid in quickly identifying their position on the </w:t>
+        <w:t xml:space="preserve">Users are then presented with the full leader board, in which every user is shown, along with their position, username, points, number of completed courses, and a button in which users can visit other students’ profiles. The currently logged in student is highlighted green, which can aid in quickly identifying their position on the </w:t>
       </w:r>
       <w:proofErr w:type="spellStart"/>
       <w:r>
@@ -1263,8 +1203,6 @@
     <w:p/>
     <w:p/>
     <w:p>
-      <w:bookmarkStart w:id="0" w:name="_GoBack"/>
-      <w:bookmarkEnd w:id="0"/>
       <w:r>
         <w:rPr>
           <w:noProof/>
@@ -1735,13 +1673,7 @@
         <w:br/>
       </w:r>
       <w:r>
-        <w:t xml:space="preserve">In order to ensure </w:t>
-      </w:r>
-      <w:r>
-        <w:t>fairness, students will notice that the leader board utilizes joint positions. This was a design choice to ensure users positions accurately represent their performance, in terms of points and the number of courses completed, and allows for better comparis</w:t>
-      </w:r>
-      <w:r>
-        <w:t>ons against other students.</w:t>
+        <w:t>In order to ensure fairness, students will notice that the leader board utilizes joint positions. This was a design choice to ensure users positions accurately represent their performance, in terms of points and the number of courses completed, and allows for better comparisons against other students.</w:t>
       </w:r>
     </w:p>
     <w:p/>
@@ -1959,10 +1891,7 @@
     </w:p>
     <w:p>
       <w:r>
-        <w:t>The leader board page has a “Back to Dashboard” button located at the bottom of the page, w</w:t>
-      </w:r>
-      <w:r>
-        <w:t>hich students can press to return back to the dashboard page.</w:t>
+        <w:t>The leader board page has a “Back to Dashboard” button located at the bottom of the page, which students can press to return back to the dashboard page.</w:t>
       </w:r>
       <w:r>
         <w:rPr>
@@ -2353,6 +2282,67 @@
           <w:lang w:val="en-US"/>
         </w:rPr>
       </w:pPr>
+      <w:r>
+        <w:rPr>
+          <w:noProof/>
+          <w:lang w:val="en-US"/>
+        </w:rPr>
+        <w:drawing>
+          <wp:inline distT="0" distB="0" distL="0" distR="0">
+            <wp:extent cx="5731510" cy="2559685"/>
+            <wp:effectExtent l="0" t="0" r="0" b="0"/>
+            <wp:docPr id="6" name="Picture 6"/>
+            <wp:cNvGraphicFramePr>
+              <a:graphicFrameLocks xmlns:a="http://schemas.openxmlformats.org/drawingml/2006/main" noChangeAspect="1"/>
+            </wp:cNvGraphicFramePr>
+            <a:graphic xmlns:a="http://schemas.openxmlformats.org/drawingml/2006/main">
+              <a:graphicData uri="http://schemas.openxmlformats.org/drawingml/2006/picture">
+                <pic:pic xmlns:pic="http://schemas.openxmlformats.org/drawingml/2006/picture">
+                  <pic:nvPicPr>
+                    <pic:cNvPr id="6" name="User-profile1.jpg"/>
+                    <pic:cNvPicPr/>
+                  </pic:nvPicPr>
+                  <pic:blipFill>
+                    <a:blip r:embed="rId14">
+                      <a:extLst>
+                        <a:ext uri="{28A0092B-C50C-407E-A947-70E740481C1C}">
+                          <a14:useLocalDpi xmlns:a14="http://schemas.microsoft.com/office/drawing/2010/main" val="0"/>
+                        </a:ext>
+                      </a:extLst>
+                    </a:blip>
+                    <a:stretch>
+                      <a:fillRect/>
+                    </a:stretch>
+                  </pic:blipFill>
+                  <pic:spPr>
+                    <a:xfrm>
+                      <a:off x="0" y="0"/>
+                      <a:ext cx="5731510" cy="2559685"/>
+                    </a:xfrm>
+                    <a:prstGeom prst="rect">
+                      <a:avLst/>
+                    </a:prstGeom>
+                  </pic:spPr>
+                </pic:pic>
+              </a:graphicData>
+            </a:graphic>
+          </wp:inline>
+        </w:drawing>
+      </w:r>
+    </w:p>
+    <w:p>
+      <w:pPr>
+        <w:rPr>
+          <w:lang w:val="en-US"/>
+        </w:rPr>
+      </w:pPr>
+    </w:p>
+    <w:p>
+      <w:pPr>
+        <w:rPr>
+          <w:lang w:val="en-US"/>
+        </w:rPr>
+      </w:pPr>
     </w:p>
     <w:p>
       <w:pPr>
@@ -2550,10 +2540,277 @@
           <w:lang w:val="en-US"/>
         </w:rPr>
       </w:pPr>
-    </w:p>
-    <w:p>
-      <w:pPr>
-        <w:rPr>
+      <w:r>
+        <w:rPr>
+          <w:bCs/>
+          <w:lang w:val="en-US"/>
+        </w:rPr>
+        <w:t>Change Course Status</w:t>
+      </w:r>
+    </w:p>
+    <w:p>
+      <w:pPr>
+        <w:pStyle w:val="ListParagraph"/>
+        <w:numPr>
+          <w:ilvl w:val="0"/>
+          <w:numId w:val="21"/>
+        </w:numPr>
+        <w:rPr>
+          <w:bCs/>
+          <w:lang w:val="en-US"/>
+        </w:rPr>
+      </w:pPr>
+      <w:r>
+        <w:rPr>
+          <w:bCs/>
+          <w:lang w:val="en-US"/>
+        </w:rPr>
+        <w:t xml:space="preserve">Allows users to </w:t>
+      </w:r>
+      <w:r>
+        <w:rPr>
+          <w:bCs/>
+          <w:lang w:val="en-US"/>
+        </w:rPr>
+        <w:t>change the status of their completed and in progress course.</w:t>
+      </w:r>
+    </w:p>
+    <w:p>
+      <w:pPr>
+        <w:rPr>
+          <w:bCs/>
+          <w:lang w:val="en-US"/>
+        </w:rPr>
+      </w:pPr>
+      <w:r>
+        <w:rPr>
+          <w:bCs/>
+          <w:noProof/>
+          <w:lang w:val="en-US"/>
+        </w:rPr>
+        <w:drawing>
+          <wp:inline distT="0" distB="0" distL="0" distR="0">
+            <wp:extent cx="5731510" cy="2529840"/>
+            <wp:effectExtent l="0" t="0" r="0" b="0"/>
+            <wp:docPr id="9" name="Picture 9"/>
+            <wp:cNvGraphicFramePr>
+              <a:graphicFrameLocks xmlns:a="http://schemas.openxmlformats.org/drawingml/2006/main" noChangeAspect="1"/>
+            </wp:cNvGraphicFramePr>
+            <a:graphic xmlns:a="http://schemas.openxmlformats.org/drawingml/2006/main">
+              <a:graphicData uri="http://schemas.openxmlformats.org/drawingml/2006/picture">
+                <pic:pic xmlns:pic="http://schemas.openxmlformats.org/drawingml/2006/picture">
+                  <pic:nvPicPr>
+                    <pic:cNvPr id="9" name="Edit-profile1.jpg"/>
+                    <pic:cNvPicPr/>
+                  </pic:nvPicPr>
+                  <pic:blipFill>
+                    <a:blip r:embed="rId15">
+                      <a:extLst>
+                        <a:ext uri="{28A0092B-C50C-407E-A947-70E740481C1C}">
+                          <a14:useLocalDpi xmlns:a14="http://schemas.microsoft.com/office/drawing/2010/main" val="0"/>
+                        </a:ext>
+                      </a:extLst>
+                    </a:blip>
+                    <a:stretch>
+                      <a:fillRect/>
+                    </a:stretch>
+                  </pic:blipFill>
+                  <pic:spPr>
+                    <a:xfrm>
+                      <a:off x="0" y="0"/>
+                      <a:ext cx="5731510" cy="2529840"/>
+                    </a:xfrm>
+                    <a:prstGeom prst="rect">
+                      <a:avLst/>
+                    </a:prstGeom>
+                  </pic:spPr>
+                </pic:pic>
+              </a:graphicData>
+            </a:graphic>
+          </wp:inline>
+        </w:drawing>
+      </w:r>
+    </w:p>
+    <w:p>
+      <w:pPr>
+        <w:rPr>
+          <w:bCs/>
+          <w:lang w:val="en-US"/>
+        </w:rPr>
+      </w:pPr>
+      <w:r>
+        <w:rPr>
+          <w:bCs/>
+          <w:lang w:val="en-US"/>
+        </w:rPr>
+        <w:t>Add info:</w:t>
+      </w:r>
+    </w:p>
+    <w:p>
+      <w:pPr>
+        <w:rPr>
+          <w:bCs/>
+          <w:lang w:val="en-US"/>
+        </w:rPr>
+      </w:pPr>
+      <w:r>
+        <w:rPr>
+          <w:bCs/>
+          <w:noProof/>
+          <w:lang w:val="en-US"/>
+        </w:rPr>
+        <w:drawing>
+          <wp:inline distT="0" distB="0" distL="0" distR="0">
+            <wp:extent cx="5731510" cy="2542540"/>
+            <wp:effectExtent l="0" t="0" r="0" b="0"/>
+            <wp:docPr id="16" name="Picture 16"/>
+            <wp:cNvGraphicFramePr>
+              <a:graphicFrameLocks xmlns:a="http://schemas.openxmlformats.org/drawingml/2006/main" noChangeAspect="1"/>
+            </wp:cNvGraphicFramePr>
+            <a:graphic xmlns:a="http://schemas.openxmlformats.org/drawingml/2006/main">
+              <a:graphicData uri="http://schemas.openxmlformats.org/drawingml/2006/picture">
+                <pic:pic xmlns:pic="http://schemas.openxmlformats.org/drawingml/2006/picture">
+                  <pic:nvPicPr>
+                    <pic:cNvPr id="16" name="Edit-profile3.jpg"/>
+                    <pic:cNvPicPr/>
+                  </pic:nvPicPr>
+                  <pic:blipFill>
+                    <a:blip r:embed="rId16">
+                      <a:extLst>
+                        <a:ext uri="{28A0092B-C50C-407E-A947-70E740481C1C}">
+                          <a14:useLocalDpi xmlns:a14="http://schemas.microsoft.com/office/drawing/2010/main" val="0"/>
+                        </a:ext>
+                      </a:extLst>
+                    </a:blip>
+                    <a:stretch>
+                      <a:fillRect/>
+                    </a:stretch>
+                  </pic:blipFill>
+                  <pic:spPr>
+                    <a:xfrm>
+                      <a:off x="0" y="0"/>
+                      <a:ext cx="5731510" cy="2542540"/>
+                    </a:xfrm>
+                    <a:prstGeom prst="rect">
+                      <a:avLst/>
+                    </a:prstGeom>
+                  </pic:spPr>
+                </pic:pic>
+              </a:graphicData>
+            </a:graphic>
+          </wp:inline>
+        </w:drawing>
+      </w:r>
+    </w:p>
+    <w:p>
+      <w:pPr>
+        <w:rPr>
+          <w:bCs/>
+          <w:lang w:val="en-US"/>
+        </w:rPr>
+      </w:pPr>
+      <w:r>
+        <w:rPr>
+          <w:bCs/>
+          <w:lang w:val="en-US"/>
+        </w:rPr>
+        <w:t>Change course status:</w:t>
+      </w:r>
+    </w:p>
+    <w:p>
+      <w:pPr>
+        <w:rPr>
+          <w:bCs/>
+          <w:lang w:val="en-US"/>
+        </w:rPr>
+      </w:pPr>
+      <w:r>
+        <w:rPr>
+          <w:bCs/>
+          <w:noProof/>
+          <w:lang w:val="en-US"/>
+        </w:rPr>
+        <w:drawing>
+          <wp:inline distT="0" distB="0" distL="0" distR="0">
+            <wp:extent cx="5731510" cy="2534285"/>
+            <wp:effectExtent l="0" t="0" r="0" b="0"/>
+            <wp:docPr id="13" name="Picture 13"/>
+            <wp:cNvGraphicFramePr>
+              <a:graphicFrameLocks xmlns:a="http://schemas.openxmlformats.org/drawingml/2006/main" noChangeAspect="1"/>
+            </wp:cNvGraphicFramePr>
+            <a:graphic xmlns:a="http://schemas.openxmlformats.org/drawingml/2006/main">
+              <a:graphicData uri="http://schemas.openxmlformats.org/drawingml/2006/picture">
+                <pic:pic xmlns:pic="http://schemas.openxmlformats.org/drawingml/2006/picture">
+                  <pic:nvPicPr>
+                    <pic:cNvPr id="13" name="Edit-profile2.jpg"/>
+                    <pic:cNvPicPr/>
+                  </pic:nvPicPr>
+                  <pic:blipFill>
+                    <a:blip r:embed="rId17">
+                      <a:extLst>
+                        <a:ext uri="{28A0092B-C50C-407E-A947-70E740481C1C}">
+                          <a14:useLocalDpi xmlns:a14="http://schemas.microsoft.com/office/drawing/2010/main" val="0"/>
+                        </a:ext>
+                      </a:extLst>
+                    </a:blip>
+                    <a:stretch>
+                      <a:fillRect/>
+                    </a:stretch>
+                  </pic:blipFill>
+                  <pic:spPr>
+                    <a:xfrm>
+                      <a:off x="0" y="0"/>
+                      <a:ext cx="5731510" cy="2534285"/>
+                    </a:xfrm>
+                    <a:prstGeom prst="rect">
+                      <a:avLst/>
+                    </a:prstGeom>
+                  </pic:spPr>
+                </pic:pic>
+              </a:graphicData>
+            </a:graphic>
+          </wp:inline>
+        </w:drawing>
+      </w:r>
+    </w:p>
+    <w:p>
+      <w:pPr>
+        <w:rPr>
+          <w:bCs/>
+          <w:lang w:val="en-US"/>
+        </w:rPr>
+      </w:pPr>
+      <w:r>
+        <w:rPr>
+          <w:bCs/>
+          <w:lang w:val="en-US"/>
+        </w:rPr>
+        <w:t>Cancel Button</w:t>
+      </w:r>
+    </w:p>
+    <w:p>
+      <w:pPr>
+        <w:numPr>
+          <w:ilvl w:val="0"/>
+          <w:numId w:val="18"/>
+        </w:numPr>
+        <w:rPr>
+          <w:bCs/>
+          <w:lang w:val="en-US"/>
+        </w:rPr>
+      </w:pPr>
+      <w:r>
+        <w:rPr>
+          <w:bCs/>
+          <w:lang w:val="en-US"/>
+        </w:rPr>
+        <w:t>Redirects back to the Profile Page without saving changes.</w:t>
+      </w:r>
+    </w:p>
+    <w:p>
+      <w:pPr>
+        <w:rPr>
+          <w:bCs/>
           <w:lang w:val="en-US"/>
         </w:rPr>
       </w:pPr>
@@ -2592,69 +2849,69 @@
         <w:rPr>
           <w:lang w:val="en-US"/>
         </w:rPr>
-        <w:t xml:space="preserve"> updates the user’s details.</w:t>
-      </w:r>
-    </w:p>
-    <w:p>
-      <w:pPr>
-        <w:numPr>
-          <w:ilvl w:val="0"/>
-          <w:numId w:val="17"/>
-        </w:numPr>
-        <w:rPr>
-          <w:lang w:val="en-US"/>
-        </w:rPr>
-      </w:pPr>
-      <w:r>
-        <w:rPr>
-          <w:lang w:val="en-US"/>
-        </w:rPr>
-        <w:t>If an error occurs (e.g., weak password), a message is displayed.</w:t>
-      </w:r>
-    </w:p>
-    <w:p>
-      <w:pPr>
-        <w:rPr>
-          <w:lang w:val="en-US"/>
-        </w:rPr>
-      </w:pPr>
-      <w:r>
-        <w:rPr>
-          <w:bCs/>
-          <w:lang w:val="en-US"/>
-        </w:rPr>
-        <w:t>Cancel Button</w:t>
-      </w:r>
-    </w:p>
-    <w:p>
-      <w:pPr>
-        <w:numPr>
-          <w:ilvl w:val="0"/>
-          <w:numId w:val="18"/>
-        </w:numPr>
-        <w:rPr>
-          <w:lang w:val="en-US"/>
-        </w:rPr>
-      </w:pPr>
-      <w:r>
-        <w:rPr>
-          <w:lang w:val="en-US"/>
-        </w:rPr>
-        <w:t xml:space="preserve">Redirects back to the </w:t>
-      </w:r>
-      <w:r>
-        <w:rPr>
-          <w:bCs/>
-          <w:lang w:val="en-US"/>
-        </w:rPr>
-        <w:t>Profile Page</w:t>
-      </w:r>
-      <w:r>
-        <w:rPr>
-          <w:lang w:val="en-US"/>
-        </w:rPr>
-        <w:t xml:space="preserve"> without saving changes.</w:t>
-      </w:r>
+        <w:t xml:space="preserve"> updates the user’s details and redirects to user profile.</w:t>
+      </w:r>
+    </w:p>
+    <w:p>
+      <w:pPr>
+        <w:rPr>
+          <w:lang w:val="en-US"/>
+        </w:rPr>
+      </w:pPr>
+      <w:r>
+        <w:rPr>
+          <w:noProof/>
+          <w:lang w:val="en-US"/>
+        </w:rPr>
+        <w:drawing>
+          <wp:inline distT="0" distB="0" distL="0" distR="0">
+            <wp:extent cx="5731510" cy="2550795"/>
+            <wp:effectExtent l="0" t="0" r="0" b="0"/>
+            <wp:docPr id="20" name="Picture 20"/>
+            <wp:cNvGraphicFramePr>
+              <a:graphicFrameLocks xmlns:a="http://schemas.openxmlformats.org/drawingml/2006/main" noChangeAspect="1"/>
+            </wp:cNvGraphicFramePr>
+            <a:graphic xmlns:a="http://schemas.openxmlformats.org/drawingml/2006/main">
+              <a:graphicData uri="http://schemas.openxmlformats.org/drawingml/2006/picture">
+                <pic:pic xmlns:pic="http://schemas.openxmlformats.org/drawingml/2006/picture">
+                  <pic:nvPicPr>
+                    <pic:cNvPr id="20" name="Edit-profile5.jpg"/>
+                    <pic:cNvPicPr/>
+                  </pic:nvPicPr>
+                  <pic:blipFill>
+                    <a:blip r:embed="rId18">
+                      <a:extLst>
+                        <a:ext uri="{28A0092B-C50C-407E-A947-70E740481C1C}">
+                          <a14:useLocalDpi xmlns:a14="http://schemas.microsoft.com/office/drawing/2010/main" val="0"/>
+                        </a:ext>
+                      </a:extLst>
+                    </a:blip>
+                    <a:stretch>
+                      <a:fillRect/>
+                    </a:stretch>
+                  </pic:blipFill>
+                  <pic:spPr>
+                    <a:xfrm>
+                      <a:off x="0" y="0"/>
+                      <a:ext cx="5731510" cy="2550795"/>
+                    </a:xfrm>
+                    <a:prstGeom prst="rect">
+                      <a:avLst/>
+                    </a:prstGeom>
+                  </pic:spPr>
+                </pic:pic>
+              </a:graphicData>
+            </a:graphic>
+          </wp:inline>
+        </w:drawing>
+      </w:r>
+    </w:p>
+    <w:p>
+      <w:pPr>
+        <w:rPr>
+          <w:lang w:val="en-US"/>
+        </w:rPr>
+      </w:pPr>
     </w:p>
     <w:p>
       <w:pPr>
@@ -2914,6 +3171,62 @@
         </w:rPr>
         <w:t>.</w:t>
       </w:r>
+    </w:p>
+    <w:p>
+      <w:pPr>
+        <w:rPr>
+          <w:lang w:val="en-US"/>
+        </w:rPr>
+      </w:pPr>
+      <w:r>
+        <w:rPr>
+          <w:noProof/>
+          <w:lang w:val="en-US"/>
+        </w:rPr>
+        <w:drawing>
+          <wp:inline distT="0" distB="0" distL="0" distR="0" wp14:anchorId="081121AE" wp14:editId="1445BA2C">
+            <wp:extent cx="5731510" cy="2538730"/>
+            <wp:effectExtent l="0" t="0" r="0" b="0"/>
+            <wp:docPr id="19" name="Picture 19"/>
+            <wp:cNvGraphicFramePr>
+              <a:graphicFrameLocks xmlns:a="http://schemas.openxmlformats.org/drawingml/2006/main" noChangeAspect="1"/>
+            </wp:cNvGraphicFramePr>
+            <a:graphic xmlns:a="http://schemas.openxmlformats.org/drawingml/2006/main">
+              <a:graphicData uri="http://schemas.openxmlformats.org/drawingml/2006/picture">
+                <pic:pic xmlns:pic="http://schemas.openxmlformats.org/drawingml/2006/picture">
+                  <pic:nvPicPr>
+                    <pic:cNvPr id="19" name="Edit-profile4.jpg"/>
+                    <pic:cNvPicPr/>
+                  </pic:nvPicPr>
+                  <pic:blipFill>
+                    <a:blip r:embed="rId19">
+                      <a:extLst>
+                        <a:ext uri="{28A0092B-C50C-407E-A947-70E740481C1C}">
+                          <a14:useLocalDpi xmlns:a14="http://schemas.microsoft.com/office/drawing/2010/main" val="0"/>
+                        </a:ext>
+                      </a:extLst>
+                    </a:blip>
+                    <a:stretch>
+                      <a:fillRect/>
+                    </a:stretch>
+                  </pic:blipFill>
+                  <pic:spPr>
+                    <a:xfrm>
+                      <a:off x="0" y="0"/>
+                      <a:ext cx="5731510" cy="2538730"/>
+                    </a:xfrm>
+                    <a:prstGeom prst="rect">
+                      <a:avLst/>
+                    </a:prstGeom>
+                  </pic:spPr>
+                </pic:pic>
+              </a:graphicData>
+            </a:graphic>
+          </wp:inline>
+        </w:drawing>
+      </w:r>
+      <w:bookmarkStart w:id="0" w:name="_GoBack"/>
+      <w:bookmarkEnd w:id="0"/>
     </w:p>
     <w:p/>
     <w:p>
@@ -4781,6 +5094,119 @@
     </w:lvl>
   </w:abstractNum>
   <w:abstractNum w:abstractNumId="13">
+    <w:nsid w:val="49B0300A"/>
+    <w:multiLevelType w:val="hybridMultilevel"/>
+    <w:tmpl w:val="422E58CE"/>
+    <w:lvl w:ilvl="0" w:tplc="04090001">
+      <w:start w:val="1"/>
+      <w:numFmt w:val="bullet"/>
+      <w:lvlText w:val=""/>
+      <w:lvlJc w:val="left"/>
+      <w:pPr>
+        <w:ind w:left="720" w:hanging="360"/>
+      </w:pPr>
+      <w:rPr>
+        <w:rFonts w:ascii="Symbol" w:hAnsi="Symbol" w:hint="default"/>
+      </w:rPr>
+    </w:lvl>
+    <w:lvl w:ilvl="1" w:tplc="04090003" w:tentative="1">
+      <w:start w:val="1"/>
+      <w:numFmt w:val="bullet"/>
+      <w:lvlText w:val="o"/>
+      <w:lvlJc w:val="left"/>
+      <w:pPr>
+        <w:ind w:left="1440" w:hanging="360"/>
+      </w:pPr>
+      <w:rPr>
+        <w:rFonts w:ascii="Courier New" w:hAnsi="Courier New" w:cs="Courier New" w:hint="default"/>
+      </w:rPr>
+    </w:lvl>
+    <w:lvl w:ilvl="2" w:tplc="04090005" w:tentative="1">
+      <w:start w:val="1"/>
+      <w:numFmt w:val="bullet"/>
+      <w:lvlText w:val=""/>
+      <w:lvlJc w:val="left"/>
+      <w:pPr>
+        <w:ind w:left="2160" w:hanging="360"/>
+      </w:pPr>
+      <w:rPr>
+        <w:rFonts w:ascii="Wingdings" w:hAnsi="Wingdings" w:hint="default"/>
+      </w:rPr>
+    </w:lvl>
+    <w:lvl w:ilvl="3" w:tplc="04090001" w:tentative="1">
+      <w:start w:val="1"/>
+      <w:numFmt w:val="bullet"/>
+      <w:lvlText w:val=""/>
+      <w:lvlJc w:val="left"/>
+      <w:pPr>
+        <w:ind w:left="2880" w:hanging="360"/>
+      </w:pPr>
+      <w:rPr>
+        <w:rFonts w:ascii="Symbol" w:hAnsi="Symbol" w:hint="default"/>
+      </w:rPr>
+    </w:lvl>
+    <w:lvl w:ilvl="4" w:tplc="04090003" w:tentative="1">
+      <w:start w:val="1"/>
+      <w:numFmt w:val="bullet"/>
+      <w:lvlText w:val="o"/>
+      <w:lvlJc w:val="left"/>
+      <w:pPr>
+        <w:ind w:left="3600" w:hanging="360"/>
+      </w:pPr>
+      <w:rPr>
+        <w:rFonts w:ascii="Courier New" w:hAnsi="Courier New" w:cs="Courier New" w:hint="default"/>
+      </w:rPr>
+    </w:lvl>
+    <w:lvl w:ilvl="5" w:tplc="04090005" w:tentative="1">
+      <w:start w:val="1"/>
+      <w:numFmt w:val="bullet"/>
+      <w:lvlText w:val=""/>
+      <w:lvlJc w:val="left"/>
+      <w:pPr>
+        <w:ind w:left="4320" w:hanging="360"/>
+      </w:pPr>
+      <w:rPr>
+        <w:rFonts w:ascii="Wingdings" w:hAnsi="Wingdings" w:hint="default"/>
+      </w:rPr>
+    </w:lvl>
+    <w:lvl w:ilvl="6" w:tplc="04090001" w:tentative="1">
+      <w:start w:val="1"/>
+      <w:numFmt w:val="bullet"/>
+      <w:lvlText w:val=""/>
+      <w:lvlJc w:val="left"/>
+      <w:pPr>
+        <w:ind w:left="5040" w:hanging="360"/>
+      </w:pPr>
+      <w:rPr>
+        <w:rFonts w:ascii="Symbol" w:hAnsi="Symbol" w:hint="default"/>
+      </w:rPr>
+    </w:lvl>
+    <w:lvl w:ilvl="7" w:tplc="04090003" w:tentative="1">
+      <w:start w:val="1"/>
+      <w:numFmt w:val="bullet"/>
+      <w:lvlText w:val="o"/>
+      <w:lvlJc w:val="left"/>
+      <w:pPr>
+        <w:ind w:left="5760" w:hanging="360"/>
+      </w:pPr>
+      <w:rPr>
+        <w:rFonts w:ascii="Courier New" w:hAnsi="Courier New" w:cs="Courier New" w:hint="default"/>
+      </w:rPr>
+    </w:lvl>
+    <w:lvl w:ilvl="8" w:tplc="04090005" w:tentative="1">
+      <w:start w:val="1"/>
+      <w:numFmt w:val="bullet"/>
+      <w:lvlText w:val=""/>
+      <w:lvlJc w:val="left"/>
+      <w:pPr>
+        <w:ind w:left="6480" w:hanging="360"/>
+      </w:pPr>
+      <w:rPr>
+        <w:rFonts w:ascii="Wingdings" w:hAnsi="Wingdings" w:hint="default"/>
+      </w:rPr>
+    </w:lvl>
+  </w:abstractNum>
+  <w:abstractNum w:abstractNumId="14">
     <w:nsid w:val="4F4428D5"/>
     <w:multiLevelType w:val="multilevel"/>
     <w:tmpl w:val="5EB018E6"/>
@@ -4929,7 +5355,7 @@
       </w:rPr>
     </w:lvl>
   </w:abstractNum>
-  <w:abstractNum w:abstractNumId="14">
+  <w:abstractNum w:abstractNumId="15">
     <w:nsid w:val="502D153C"/>
     <w:multiLevelType w:val="multilevel"/>
     <w:tmpl w:val="8828FF0E"/>
@@ -5078,7 +5504,7 @@
       </w:rPr>
     </w:lvl>
   </w:abstractNum>
-  <w:abstractNum w:abstractNumId="15">
+  <w:abstractNum w:abstractNumId="16">
     <w:nsid w:val="5F0625A8"/>
     <w:multiLevelType w:val="multilevel"/>
     <w:tmpl w:val="CE42726E"/>
@@ -5227,7 +5653,7 @@
       </w:rPr>
     </w:lvl>
   </w:abstractNum>
-  <w:abstractNum w:abstractNumId="16">
+  <w:abstractNum w:abstractNumId="17">
     <w:nsid w:val="6FA44483"/>
     <w:multiLevelType w:val="multilevel"/>
     <w:tmpl w:val="39E8C2C8"/>
@@ -5376,7 +5802,7 @@
       </w:rPr>
     </w:lvl>
   </w:abstractNum>
-  <w:abstractNum w:abstractNumId="17">
+  <w:abstractNum w:abstractNumId="18">
     <w:nsid w:val="77AC5D83"/>
     <w:multiLevelType w:val="multilevel"/>
     <w:tmpl w:val="6BB2F0C6"/>
@@ -5525,7 +5951,7 @@
       </w:rPr>
     </w:lvl>
   </w:abstractNum>
-  <w:abstractNum w:abstractNumId="18">
+  <w:abstractNum w:abstractNumId="19">
     <w:nsid w:val="78D13ADA"/>
     <w:multiLevelType w:val="multilevel"/>
     <w:tmpl w:val="088EA55C"/>
@@ -5647,7 +6073,7 @@
       </w:pPr>
     </w:lvl>
   </w:abstractNum>
-  <w:abstractNum w:abstractNumId="19">
+  <w:abstractNum w:abstractNumId="20">
     <w:nsid w:val="7B803607"/>
     <w:multiLevelType w:val="multilevel"/>
     <w:tmpl w:val="D956590A"/>
@@ -5797,13 +6223,13 @@
     </w:lvl>
   </w:abstractNum>
   <w:num w:numId="1">
-    <w:abstractNumId w:val="13"/>
+    <w:abstractNumId w:val="14"/>
   </w:num>
   <w:num w:numId="2">
     <w:abstractNumId w:val="10"/>
   </w:num>
   <w:num w:numId="3">
-    <w:abstractNumId w:val="14"/>
+    <w:abstractNumId w:val="15"/>
   </w:num>
   <w:num w:numId="4">
     <w:abstractNumId w:val="9"/>
@@ -5818,10 +6244,10 @@
     <w:abstractNumId w:val="5"/>
   </w:num>
   <w:num w:numId="8">
-    <w:abstractNumId w:val="18"/>
+    <w:abstractNumId w:val="19"/>
   </w:num>
   <w:num w:numId="9">
-    <w:abstractNumId w:val="15"/>
+    <w:abstractNumId w:val="16"/>
   </w:num>
   <w:num w:numId="10">
     <w:abstractNumId w:val="6"/>
@@ -5830,13 +6256,13 @@
     <w:abstractNumId w:val="8"/>
   </w:num>
   <w:num w:numId="12">
-    <w:abstractNumId w:val="17"/>
+    <w:abstractNumId w:val="18"/>
   </w:num>
   <w:num w:numId="13">
     <w:abstractNumId w:val="11"/>
   </w:num>
   <w:num w:numId="14">
-    <w:abstractNumId w:val="19"/>
+    <w:abstractNumId w:val="20"/>
   </w:num>
   <w:num w:numId="15">
     <w:abstractNumId w:val="4"/>
@@ -5845,7 +6271,7 @@
     <w:abstractNumId w:val="0"/>
   </w:num>
   <w:num w:numId="17">
-    <w:abstractNumId w:val="16"/>
+    <w:abstractNumId w:val="17"/>
   </w:num>
   <w:num w:numId="18">
     <w:abstractNumId w:val="1"/>
@@ -5855,6 +6281,9 @@
   </w:num>
   <w:num w:numId="20">
     <w:abstractNumId w:val="7"/>
+  </w:num>
+  <w:num w:numId="21">
+    <w:abstractNumId w:val="13"/>
   </w:num>
 </w:numbering>
 </file>

</xml_diff>

<commit_message>
user manual search and filter text
</commit_message>
<xml_diff>
--- a/IBM_SkillsBuild_Gamification_User_Manual.docx
+++ b/IBM_SkillsBuild_Gamification_User_Manual.docx
@@ -1,6 +1,6 @@
 
 <file path=word/document.xml><?xml version="1.0" encoding="utf-8"?>
-<w:document xmlns:wpc="http://schemas.microsoft.com/office/word/2010/wordprocessingCanvas" xmlns:mc="http://schemas.openxmlformats.org/markup-compatibility/2006" xmlns:o="urn:schemas-microsoft-com:office:office" xmlns:r="http://schemas.openxmlformats.org/officeDocument/2006/relationships" xmlns:m="http://schemas.openxmlformats.org/officeDocument/2006/math" xmlns:v="urn:schemas-microsoft-com:vml" xmlns:wp14="http://schemas.microsoft.com/office/word/2010/wordprocessingDrawing" xmlns:wp="http://schemas.openxmlformats.org/drawingml/2006/wordprocessingDrawing" xmlns:w10="urn:schemas-microsoft-com:office:word" xmlns:w="http://schemas.openxmlformats.org/wordprocessingml/2006/main" xmlns:w14="http://schemas.microsoft.com/office/word/2010/wordml" xmlns:w15="http://schemas.microsoft.com/office/word/2012/wordml" xmlns:wpg="http://schemas.microsoft.com/office/word/2010/wordprocessingGroup" xmlns:wpi="http://schemas.microsoft.com/office/word/2010/wordprocessingInk" xmlns:wne="http://schemas.microsoft.com/office/word/2006/wordml" xmlns:wps="http://schemas.microsoft.com/office/word/2010/wordprocessingShape" mc:Ignorable="w14 w15 wp14">
+<w:document xmlns:wpc="http://schemas.microsoft.com/office/word/2010/wordprocessingCanvas" xmlns:cx="http://schemas.microsoft.com/office/drawing/2014/chartex" xmlns:cx1="http://schemas.microsoft.com/office/drawing/2015/9/8/chartex" xmlns:cx2="http://schemas.microsoft.com/office/drawing/2015/10/21/chartex" xmlns:cx3="http://schemas.microsoft.com/office/drawing/2016/5/9/chartex" xmlns:cx4="http://schemas.microsoft.com/office/drawing/2016/5/10/chartex" xmlns:cx5="http://schemas.microsoft.com/office/drawing/2016/5/11/chartex" xmlns:cx6="http://schemas.microsoft.com/office/drawing/2016/5/12/chartex" xmlns:cx7="http://schemas.microsoft.com/office/drawing/2016/5/13/chartex" xmlns:cx8="http://schemas.microsoft.com/office/drawing/2016/5/14/chartex" xmlns:mc="http://schemas.openxmlformats.org/markup-compatibility/2006" xmlns:aink="http://schemas.microsoft.com/office/drawing/2016/ink" xmlns:am3d="http://schemas.microsoft.com/office/drawing/2017/model3d" xmlns:o="urn:schemas-microsoft-com:office:office" xmlns:oel="http://schemas.microsoft.com/office/2019/extlst" xmlns:r="http://schemas.openxmlformats.org/officeDocument/2006/relationships" xmlns:m="http://schemas.openxmlformats.org/officeDocument/2006/math" xmlns:v="urn:schemas-microsoft-com:vml" xmlns:wp14="http://schemas.microsoft.com/office/word/2010/wordprocessingDrawing" xmlns:wp="http://schemas.openxmlformats.org/drawingml/2006/wordprocessingDrawing" xmlns:w10="urn:schemas-microsoft-com:office:word" xmlns:w="http://schemas.openxmlformats.org/wordprocessingml/2006/main" xmlns:w14="http://schemas.microsoft.com/office/word/2010/wordml" xmlns:w15="http://schemas.microsoft.com/office/word/2012/wordml" xmlns:w16cex="http://schemas.microsoft.com/office/word/2018/wordml/cex" xmlns:w16cid="http://schemas.microsoft.com/office/word/2016/wordml/cid" xmlns:w16="http://schemas.microsoft.com/office/word/2018/wordml" xmlns:w16du="http://schemas.microsoft.com/office/word/2023/wordml/word16du" xmlns:w16sdtdh="http://schemas.microsoft.com/office/word/2020/wordml/sdtdatahash" xmlns:w16sdtfl="http://schemas.microsoft.com/office/word/2024/wordml/sdtformatlock" xmlns:w16se="http://schemas.microsoft.com/office/word/2015/wordml/symex" xmlns:wpg="http://schemas.microsoft.com/office/word/2010/wordprocessingGroup" xmlns:wpi="http://schemas.microsoft.com/office/word/2010/wordprocessingInk" xmlns:wne="http://schemas.microsoft.com/office/word/2006/wordml" xmlns:wps="http://schemas.microsoft.com/office/word/2010/wordprocessingShape" mc:Ignorable="w14 w15 w16se w16cid w16 w16cex w16sdtdh w16sdtfl w16du wp14">
   <w:body>
     <w:p>
       <w:r>
@@ -12,69 +12,8 @@
           <w:szCs w:val="28"/>
           <w:u w:val="single"/>
         </w:rPr>
-        <w:t xml:space="preserve">IMB </w:t>
-      </w:r>
-      <w:proofErr w:type="spellStart"/>
-      <w:r>
-        <w:rPr>
-          <w:rFonts w:ascii="Aptos (Heading)" w:hAnsi="Aptos (Heading)"/>
-          <w:b/>
-          <w:bCs/>
-          <w:sz w:val="28"/>
-          <w:szCs w:val="28"/>
-          <w:u w:val="single"/>
-        </w:rPr>
-        <w:t>SkillsBuild</w:t>
-      </w:r>
-      <w:proofErr w:type="spellEnd"/>
-      <w:r>
-        <w:rPr>
-          <w:rFonts w:ascii="Aptos (Heading)" w:hAnsi="Aptos (Heading)"/>
-          <w:b/>
-          <w:bCs/>
-          <w:sz w:val="28"/>
-          <w:szCs w:val="28"/>
-          <w:u w:val="single"/>
-        </w:rPr>
-        <w:t xml:space="preserve"> </w:t>
-      </w:r>
-      <w:proofErr w:type="spellStart"/>
-      <w:r>
-        <w:rPr>
-          <w:rFonts w:ascii="Aptos (Heading)" w:hAnsi="Aptos (Heading)"/>
-          <w:b/>
-          <w:bCs/>
-          <w:sz w:val="28"/>
-          <w:szCs w:val="28"/>
-          <w:u w:val="single"/>
-        </w:rPr>
-        <w:t>Gamification</w:t>
-      </w:r>
-      <w:proofErr w:type="spellEnd"/>
-      <w:r>
-        <w:rPr>
-          <w:rFonts w:ascii="Aptos (Heading)" w:hAnsi="Aptos (Heading)"/>
-          <w:b/>
-          <w:bCs/>
-          <w:sz w:val="28"/>
-          <w:szCs w:val="28"/>
-          <w:u w:val="single"/>
-        </w:rPr>
-        <w:t xml:space="preserve"> User Manual</w:t>
-      </w:r>
-      <w:proofErr w:type="gramStart"/>
-      <w:r>
-        <w:rPr>
-          <w:rFonts w:ascii="Aptos (Heading)" w:hAnsi="Aptos (Heading)"/>
-          <w:b/>
-          <w:bCs/>
-          <w:sz w:val="28"/>
-          <w:szCs w:val="28"/>
-          <w:u w:val="single"/>
-        </w:rPr>
-        <w:t>:</w:t>
-      </w:r>
-      <w:proofErr w:type="gramEnd"/>
+        <w:t>IMB SkillsBuild Gamification User Manual:</w:t>
+      </w:r>
       <w:r>
         <w:rPr>
           <w:b/>
@@ -95,58 +34,12 @@
     </w:p>
     <w:p>
       <w:r>
-        <w:t xml:space="preserve">IBM </w:t>
-      </w:r>
-      <w:proofErr w:type="spellStart"/>
-      <w:r>
-        <w:t>SkillsBuild</w:t>
-      </w:r>
-      <w:proofErr w:type="spellEnd"/>
-      <w:r>
-        <w:t xml:space="preserve"> </w:t>
-      </w:r>
-      <w:proofErr w:type="spellStart"/>
-      <w:r>
-        <w:t>Gamification</w:t>
-      </w:r>
-      <w:proofErr w:type="spellEnd"/>
-      <w:r>
-        <w:t xml:space="preserve"> is a tool designed to enhance engagement with IBM </w:t>
-      </w:r>
-      <w:proofErr w:type="spellStart"/>
-      <w:r>
-        <w:t>SkillsBuild</w:t>
-      </w:r>
-      <w:proofErr w:type="spellEnd"/>
-      <w:r>
-        <w:t xml:space="preserve"> by introducing a </w:t>
-      </w:r>
-      <w:proofErr w:type="spellStart"/>
-      <w:r>
-        <w:t>leaderboard</w:t>
-      </w:r>
-      <w:proofErr w:type="spellEnd"/>
-      <w:r>
-        <w:t xml:space="preserve"> and levelling system. It allows users to track their progress and encourages </w:t>
-      </w:r>
-      <w:r>
-        <w:t xml:space="preserve">participation through a competitive learning environment. The software aims to make online learning more interactive and rewarding, focusing on students using IBM </w:t>
-      </w:r>
-      <w:proofErr w:type="spellStart"/>
-      <w:r>
-        <w:t>SkillsBuild</w:t>
-      </w:r>
-      <w:proofErr w:type="spellEnd"/>
-      <w:r>
-        <w:t xml:space="preserve"> to develop key skills in computer science.</w:t>
-      </w:r>
-    </w:p>
-    <w:p>
-      <w:r>
-        <w:t>This manual provides guidance on how t</w:t>
-      </w:r>
-      <w:r>
-        <w:t>o install, navigate, and use all available features of the software.</w:t>
+        <w:t>IBM SkillsBuild Gamification is a tool designed to enhance engagement with IBM SkillsBuild by introducing a leaderboard and levelling system. It allows users to track their progress and encourages participation through a competitive learning environment. The software aims to make online learning more interactive and rewarding, focusing on students using IBM SkillsBuild to develop key skills in computer science.</w:t>
+      </w:r>
+    </w:p>
+    <w:p>
+      <w:r>
+        <w:t>This manual provides guidance on how to install, navigate, and use all available features of the software.</w:t>
       </w:r>
     </w:p>
     <w:p/>
@@ -188,18 +81,7 @@
     </w:p>
     <w:p>
       <w:r>
-        <w:t xml:space="preserve">The Dashboard serves as the main interface for users to access courses, track progress, and navigate to key sections such as the </w:t>
-      </w:r>
-      <w:proofErr w:type="spellStart"/>
-      <w:r>
-        <w:t>Leaderboard</w:t>
-      </w:r>
-      <w:proofErr w:type="spellEnd"/>
-      <w:r>
-        <w:t xml:space="preserve"> and U</w:t>
-      </w:r>
-      <w:r>
-        <w:t>ser Profile. It provides an easy-to-use layout for selecting courses and updating learning progress.</w:t>
+        <w:t>The Dashboard serves as the main interface for users to access courses, track progress, and navigate to key sections such as the Leaderboard and User Profile. It provides an easy-to-use layout for selecting courses and updating learning progress.</w:t>
       </w:r>
     </w:p>
     <w:p>
@@ -240,7 +122,7 @@
           <w:lang w:val="en-US"/>
         </w:rPr>
         <w:drawing>
-          <wp:inline distT="0" distB="0" distL="0" distR="0">
+          <wp:inline distT="0" distB="0" distL="0" distR="0" wp14:anchorId="04DDC3B8" wp14:editId="04DDC3B9">
             <wp:extent cx="5560060" cy="1828800"/>
             <wp:effectExtent l="0" t="0" r="0" b="0"/>
             <wp:docPr id="1" name="Picture 1" descr="A screenshot of a dashboard&#10;&#10;AI-generated content may be incorrect."/>
@@ -257,7 +139,7 @@
                     </pic:cNvPicPr>
                   </pic:nvPicPr>
                   <pic:blipFill>
-                    <a:blip r:embed="rId5"/>
+                    <a:blip r:embed="rId6"/>
                     <a:stretch>
                       <a:fillRect/>
                     </a:stretch>
@@ -303,10 +185,7 @@
         </w:numPr>
       </w:pPr>
       <w:r>
-        <w:t>The dashboard displays multiple courses in in</w:t>
-      </w:r>
-      <w:r>
-        <w:t>dividual grey boxes, each representing a different learning module.</w:t>
+        <w:t>The dashboard displays multiple courses in individual grey boxes, each representing a different learning module.</w:t>
       </w:r>
     </w:p>
     <w:p>
@@ -318,15 +197,7 @@
         </w:numPr>
       </w:pPr>
       <w:r>
-        <w:t xml:space="preserve">Users can click a course tile to be redirected to the official IBM </w:t>
-      </w:r>
-      <w:proofErr w:type="spellStart"/>
-      <w:r>
-        <w:t>SkillsBuild</w:t>
-      </w:r>
-      <w:proofErr w:type="spellEnd"/>
-      <w:r>
-        <w:t xml:space="preserve"> website, where they can access the course content.</w:t>
+        <w:t>Users can click a course tile to be redirected to the official IBM SkillsBuild website, where they can access the course content.</w:t>
       </w:r>
     </w:p>
     <w:p>
@@ -337,15 +208,7 @@
         </w:numPr>
       </w:pPr>
       <w:r>
-        <w:t xml:space="preserve">After completing or progressing through the course on IBM </w:t>
-      </w:r>
-      <w:proofErr w:type="spellStart"/>
-      <w:r>
-        <w:t>SkillsBuild</w:t>
-      </w:r>
-      <w:proofErr w:type="spellEnd"/>
-      <w:r>
-        <w:t>, users return to the platform to update their course status.</w:t>
+        <w:t>After completing or progressing through the course on IBM SkillsBuild, users return to the platform to update their course status.</w:t>
       </w:r>
     </w:p>
     <w:p>
@@ -377,11 +240,9 @@
           <w:numId w:val="1"/>
         </w:numPr>
       </w:pPr>
-      <w:proofErr w:type="spellStart"/>
       <w:r>
         <w:t>Cybersecurity</w:t>
       </w:r>
-      <w:proofErr w:type="spellEnd"/>
     </w:p>
     <w:p>
       <w:pPr>
@@ -391,18 +252,13 @@
         </w:numPr>
       </w:pPr>
       <w:r>
+        <w:lastRenderedPageBreak/>
         <w:t>Cloud Computing</w:t>
       </w:r>
     </w:p>
     <w:p>
-      <w:proofErr w:type="spellStart"/>
-      <w:r>
-        <w:lastRenderedPageBreak/>
-        <w:t>Leaderboard</w:t>
-      </w:r>
-      <w:proofErr w:type="spellEnd"/>
-      <w:r>
-        <w:t xml:space="preserve"> Button:</w:t>
+      <w:r>
+        <w:t>Leaderboard Button:</w:t>
       </w:r>
     </w:p>
     <w:p>
@@ -413,18 +269,7 @@
         </w:numPr>
       </w:pPr>
       <w:r>
-        <w:t xml:space="preserve">Clicking this button takes the user to the </w:t>
-      </w:r>
-      <w:proofErr w:type="spellStart"/>
-      <w:r>
-        <w:t>Leaderboard</w:t>
-      </w:r>
-      <w:proofErr w:type="spellEnd"/>
-      <w:r>
-        <w:t xml:space="preserve">, where they can </w:t>
-      </w:r>
-      <w:r>
-        <w:t>see rankings based on progress and achievements.</w:t>
+        <w:t>Clicking this button takes the user to the Leaderboard, where they can see rankings based on progress and achievements.</w:t>
       </w:r>
     </w:p>
     <w:p>
@@ -463,13 +308,7 @@
         <w:rPr>
           <w:u w:val="single"/>
         </w:rPr>
-        <w:t xml:space="preserve"> </w:t>
-      </w:r>
-      <w:r>
-        <w:rPr>
-          <w:u w:val="single"/>
-        </w:rPr>
-        <w:t>Course Status Page</w:t>
+        <w:t xml:space="preserve"> Course Status Page</w:t>
       </w:r>
     </w:p>
     <w:p>
@@ -484,7 +323,7 @@
           <w:lang w:val="en-US"/>
         </w:rPr>
         <w:drawing>
-          <wp:inline distT="0" distB="0" distL="0" distR="0">
+          <wp:inline distT="0" distB="0" distL="0" distR="0" wp14:anchorId="04DDC3BA" wp14:editId="04DDC3BB">
             <wp:extent cx="4625975" cy="2284095"/>
             <wp:effectExtent l="0" t="0" r="0" b="0"/>
             <wp:docPr id="2" name="Image2" descr="A screen shot of a computer&#10;&#10;AI-generated content may be incorrect."/>
@@ -501,7 +340,7 @@
                     </pic:cNvPicPr>
                   </pic:nvPicPr>
                   <pic:blipFill>
-                    <a:blip r:embed="rId6"/>
+                    <a:blip r:embed="rId7"/>
                     <a:stretch>
                       <a:fillRect/>
                     </a:stretch>
@@ -552,18 +391,7 @@
         </w:numPr>
       </w:pPr>
       <w:r>
-        <w:t>The name of the selected course (e.g., "</w:t>
-      </w:r>
-      <w:proofErr w:type="spellStart"/>
-      <w:r>
-        <w:t>Cybersecurity</w:t>
-      </w:r>
-      <w:proofErr w:type="spellEnd"/>
-      <w:r>
-        <w:t>") is displayed at the top to indicate the current course being update</w:t>
-      </w:r>
-      <w:r>
-        <w:t>d.</w:t>
+        <w:t>The name of the selected course (e.g., "Cybersecurity") is displayed at the top to indicate the current course being updated.</w:t>
       </w:r>
     </w:p>
     <w:p>
@@ -633,10 +461,7 @@
     </w:p>
     <w:p>
       <w:r>
-        <w:t>Save Status Butto</w:t>
-      </w:r>
-      <w:r>
-        <w:t>n:</w:t>
+        <w:t>Save Status Button:</w:t>
       </w:r>
     </w:p>
     <w:p>
@@ -657,7 +482,6 @@
       <w:r>
         <w:t xml:space="preserve">2. </w:t>
       </w:r>
-      <w:proofErr w:type="spellStart"/>
       <w:r>
         <w:rPr>
           <w:b/>
@@ -665,14 +489,10 @@
         </w:rPr>
         <w:t>Leaderboard</w:t>
       </w:r>
-      <w:proofErr w:type="spellEnd"/>
-    </w:p>
-    <w:p>
-      <w:r>
-        <w:t xml:space="preserve">The leader board is a way for students to see all students, ranked in order of the number of points they scored, from highest to lowest. This </w:t>
-      </w:r>
-      <w:r>
-        <w:t>allows students to compare progress, and it may motivate them to complete more courses, to climb the leader board, and see their name at the very top!</w:t>
+    </w:p>
+    <w:p>
+      <w:r>
+        <w:t>The leader board is a way for students to see all students, ranked in order of the number of points they scored, from highest to lowest. This allows students to compare progress, and it may motivate them to complete more courses, to climb the leader board, and see their name at the very top!</w:t>
       </w:r>
     </w:p>
     <w:p>
@@ -687,7 +507,7 @@
           <w:lang w:val="en-US"/>
         </w:rPr>
         <w:drawing>
-          <wp:anchor distT="0" distB="0" distL="0" distR="0" simplePos="0" relativeHeight="4" behindDoc="0" locked="0" layoutInCell="0" allowOverlap="1">
+          <wp:anchor distT="0" distB="0" distL="0" distR="0" simplePos="0" relativeHeight="4" behindDoc="0" locked="0" layoutInCell="0" allowOverlap="1" wp14:anchorId="04DDC3BC" wp14:editId="04DDC3BD">
             <wp:simplePos x="0" y="0"/>
             <wp:positionH relativeFrom="column">
               <wp:posOffset>-509905</wp:posOffset>
@@ -712,7 +532,7 @@
                     </pic:cNvPicPr>
                   </pic:nvPicPr>
                   <pic:blipFill>
-                    <a:blip r:embed="rId7"/>
+                    <a:blip r:embed="rId8"/>
                     <a:stretch>
                       <a:fillRect/>
                     </a:stretch>
@@ -741,37 +561,7 @@
     </w:p>
     <w:p>
       <w:r>
-        <w:t xml:space="preserve">Sorting: Users are met by the leader board page, when pressing the </w:t>
-      </w:r>
-      <w:proofErr w:type="spellStart"/>
-      <w:r>
-        <w:t>leaderboard</w:t>
-      </w:r>
-      <w:proofErr w:type="spellEnd"/>
-      <w:r>
-        <w:t xml:space="preserve"> button on the dashboa</w:t>
-      </w:r>
-      <w:r>
-        <w:t xml:space="preserve">rd page, where they will see some information about sorting the </w:t>
-      </w:r>
-      <w:proofErr w:type="spellStart"/>
-      <w:r>
-        <w:t>leaderboard</w:t>
-      </w:r>
-      <w:proofErr w:type="spellEnd"/>
-      <w:r>
-        <w:t xml:space="preserve">. Each button corresponds to a way to sort the </w:t>
-      </w:r>
-      <w:proofErr w:type="spellStart"/>
-      <w:r>
-        <w:t>leaderboard</w:t>
-      </w:r>
-      <w:proofErr w:type="spellEnd"/>
-      <w:r>
-        <w:t>, for example, sorting by lowest points first, sorting alphabetically (usernames A – Z) or sorting by the number of courses</w:t>
-      </w:r>
-      <w:r>
-        <w:t xml:space="preserve"> completed.</w:t>
+        <w:t>Sorting: Users are met by the leader board page, when pressing the leaderboard button on the dashboard page, where they will see some information about sorting the leaderboard. Each button corresponds to a way to sort the leaderboard, for example, sorting by lowest points first, sorting alphabetically (usernames A – Z) or sorting by the number of courses completed.</w:t>
       </w:r>
     </w:p>
     <w:p/>
@@ -789,7 +579,7 @@
         <mc:AlternateContent>
           <mc:Choice Requires="wps">
             <w:drawing>
-              <wp:anchor distT="0" distB="0" distL="0" distR="0" simplePos="0" relativeHeight="7" behindDoc="0" locked="0" layoutInCell="0" allowOverlap="1">
+              <wp:anchor distT="0" distB="0" distL="0" distR="0" simplePos="0" relativeHeight="7" behindDoc="0" locked="0" layoutInCell="0" allowOverlap="1" wp14:anchorId="04DDC3BE" wp14:editId="04DDC3BF">
                 <wp:simplePos x="0" y="0"/>
                 <wp:positionH relativeFrom="column">
                   <wp:posOffset>1157605</wp:posOffset>
@@ -830,7 +620,7 @@
                                 <w:lang w:val="en-US"/>
                               </w:rPr>
                               <w:drawing>
-                                <wp:inline distT="0" distB="0" distL="0" distR="0">
+                                <wp:inline distT="0" distB="0" distL="0" distR="0" wp14:anchorId="04DDC3CF" wp14:editId="04DDC3D0">
                                   <wp:extent cx="3199130" cy="665480"/>
                                   <wp:effectExtent l="0" t="0" r="0" b="0"/>
                                   <wp:docPr id="5" name="Image3"/>
@@ -847,7 +637,7 @@
                                           </pic:cNvPicPr>
                                         </pic:nvPicPr>
                                         <pic:blipFill>
-                                          <a:blip r:embed="rId8"/>
+                                          <a:blip r:embed="rId9"/>
                                           <a:stretch>
                                             <a:fillRect/>
                                           </a:stretch>
@@ -868,10 +658,7 @@
                               </w:drawing>
                             </w:r>
                             <w:r>
-                              <w:t xml:space="preserve">Current </w:t>
-                            </w:r>
-                            <w:r>
-                              <w:t>sorting changes to show the currently selected sorting option</w:t>
+                              <w:t>Current sorting changes to show the currently selected sorting option</w:t>
                             </w:r>
                           </w:p>
                         </w:txbxContent>
@@ -921,7 +708,7 @@
                                     </pic:cNvPicPr>
                                   </pic:nvPicPr>
                                   <pic:blipFill>
-                                    <a:blip r:embed="rId8"/>
+                                    <a:blip r:embed="rId10"/>
                                     <a:stretch>
                                       <a:fillRect/>
                                     </a:stretch>
@@ -1001,34 +788,14 @@
         <w:rPr>
           <w:u w:val="single"/>
         </w:rPr>
-        <w:t xml:space="preserve">2.3 – User Position in </w:t>
-      </w:r>
-      <w:proofErr w:type="spellStart"/>
-      <w:r>
+        <w:t>2.3 – User Position in leaderboard shown in separate section</w:t>
+      </w:r>
+    </w:p>
+    <w:p>
+      <w:pPr>
         <w:rPr>
           <w:u w:val="single"/>
         </w:rPr>
-        <w:t>leaderboard</w:t>
-      </w:r>
-      <w:proofErr w:type="spellEnd"/>
-      <w:r>
-        <w:rPr>
-          <w:u w:val="single"/>
-        </w:rPr>
-        <w:t xml:space="preserve"> shown in separate sec</w:t>
-      </w:r>
-      <w:r>
-        <w:rPr>
-          <w:u w:val="single"/>
-        </w:rPr>
-        <w:t>tion</w:t>
-      </w:r>
-    </w:p>
-    <w:p>
-      <w:pPr>
-        <w:rPr>
-          <w:u w:val="single"/>
-        </w:rPr>
       </w:pPr>
     </w:p>
     <w:p/>
@@ -1038,10 +805,7 @@
       </w:r>
       <w:r>
         <w:br/>
-        <w:t>Users can see their position in the leader board, in a separate section before the full leader board is shown. This helps as if there are many users, it allows users to quickly see their progress, and compare this to others via their position, wit</w:t>
-      </w:r>
-      <w:r>
-        <w:t>hout having to scroll down for long. For example, if there are 100 users, and user “bob12” is in position 58, they do not have to scroll down a lot, to be able to find their position and see how they are doing relative to others.</w:t>
+        <w:t>Users can see their position in the leader board, in a separate section before the full leader board is shown. This helps as if there are many users, it allows users to quickly see their progress, and compare this to others via their position, without having to scroll down for long. For example, if there are 100 users, and user “bob12” is in position 58, they do not have to scroll down a lot, to be able to find their position and see how they are doing relative to others.</w:t>
       </w:r>
       <w:r>
         <w:rPr>
@@ -1051,7 +815,7 @@
         <mc:AlternateContent>
           <mc:Choice Requires="wps">
             <w:drawing>
-              <wp:anchor distT="0" distB="0" distL="0" distR="0" simplePos="0" relativeHeight="5" behindDoc="0" locked="0" layoutInCell="0" allowOverlap="1">
+              <wp:anchor distT="0" distB="0" distL="0" distR="0" simplePos="0" relativeHeight="5" behindDoc="0" locked="0" layoutInCell="0" allowOverlap="1" wp14:anchorId="04DDC3C0" wp14:editId="04DDC3C1">
                 <wp:simplePos x="0" y="0"/>
                 <wp:positionH relativeFrom="column">
                   <wp:align>center</wp:align>
@@ -1092,7 +856,7 @@
                                 <w:lang w:val="en-US"/>
                               </w:rPr>
                               <w:drawing>
-                                <wp:inline distT="0" distB="0" distL="0" distR="0">
+                                <wp:inline distT="0" distB="0" distL="0" distR="0" wp14:anchorId="04DDC3D1" wp14:editId="04DDC3D2">
                                   <wp:extent cx="6120130" cy="1558290"/>
                                   <wp:effectExtent l="0" t="0" r="0" b="0"/>
                                   <wp:docPr id="8" name="Image2 Copy 1"/>
@@ -1109,7 +873,7 @@
                                           </pic:cNvPicPr>
                                         </pic:nvPicPr>
                                         <pic:blipFill>
-                                          <a:blip r:embed="rId9"/>
+                                          <a:blip r:embed="rId11"/>
                                           <a:stretch>
                                             <a:fillRect/>
                                           </a:stretch>
@@ -1130,10 +894,7 @@
                               </w:drawing>
                             </w:r>
                             <w:r>
-                              <w:t>Users can see their pos</w:t>
-                            </w:r>
-                            <w:r>
-                              <w:t>ition in a separated section before the full leader board</w:t>
+                              <w:t>Users can see their position in a separated section before the full leader board</w:t>
                             </w:r>
                           </w:p>
                         </w:txbxContent>
@@ -1179,7 +940,7 @@
                                     </pic:cNvPicPr>
                                   </pic:nvPicPr>
                                   <pic:blipFill>
-                                    <a:blip r:embed="rId9"/>
+                                    <a:blip r:embed="rId12"/>
                                     <a:stretch>
                                       <a:fillRect/>
                                     </a:stretch>
@@ -1226,52 +987,32 @@
         <w:rPr>
           <w:u w:val="single"/>
         </w:rPr>
-        <w:t xml:space="preserve">2.3 – Global </w:t>
-      </w:r>
-      <w:proofErr w:type="spellStart"/>
-      <w:r>
+        <w:t>2.3 – Global Leaderboard</w:t>
+      </w:r>
+    </w:p>
+    <w:p>
+      <w:pPr>
         <w:rPr>
           <w:u w:val="single"/>
         </w:rPr>
-        <w:t>Leaderboard</w:t>
-      </w:r>
-      <w:proofErr w:type="spellEnd"/>
-    </w:p>
-    <w:p>
-      <w:pPr>
-        <w:rPr>
-          <w:u w:val="single"/>
-        </w:rPr>
-      </w:pPr>
-    </w:p>
-    <w:p>
-      <w:r>
-        <w:t xml:space="preserve">Users are then presented with the full leader board, in which every user is shown, along with their position, username, points, number of completed courses, and a button </w:t>
-      </w:r>
-      <w:r>
-        <w:t xml:space="preserve">in which users can visit other students’ profiles. The currently logged in student is highlighted green, which can aid in quickly identifying their position on the </w:t>
-      </w:r>
-      <w:proofErr w:type="spellStart"/>
-      <w:r>
-        <w:t>leaderboard</w:t>
-      </w:r>
-      <w:proofErr w:type="spellEnd"/>
-      <w:r>
-        <w:t>, from which they can compare themselves against those around them.</w:t>
+      </w:pPr>
+    </w:p>
+    <w:p>
+      <w:r>
+        <w:t>Users are then presented with the full leader board, in which every user is shown, along with their position, username, points, number of completed courses, and a button in which users can visit other students’ profiles. The currently logged in student is highlighted green, which can aid in quickly identifying their position on the leaderboard, from which they can compare themselves against those around them.</w:t>
       </w:r>
     </w:p>
     <w:p/>
     <w:p/>
     <w:p>
-      <w:bookmarkStart w:id="0" w:name="_GoBack"/>
-      <w:bookmarkEnd w:id="0"/>
       <w:r>
         <w:rPr>
           <w:noProof/>
           <w:lang w:val="en-US"/>
         </w:rPr>
+        <w:lastRenderedPageBreak/>
         <w:drawing>
-          <wp:anchor distT="0" distB="0" distL="0" distR="0" simplePos="0" relativeHeight="11" behindDoc="0" locked="0" layoutInCell="0" allowOverlap="1">
+          <wp:anchor distT="0" distB="0" distL="0" distR="0" simplePos="0" relativeHeight="11" behindDoc="0" locked="0" layoutInCell="0" allowOverlap="1" wp14:anchorId="04DDC3C2" wp14:editId="04DDC3C3">
             <wp:simplePos x="0" y="0"/>
             <wp:positionH relativeFrom="column">
               <wp:posOffset>610870</wp:posOffset>
@@ -1296,7 +1037,7 @@
                     </pic:cNvPicPr>
                   </pic:nvPicPr>
                   <pic:blipFill>
-                    <a:blip r:embed="rId10"/>
+                    <a:blip r:embed="rId13"/>
                     <a:stretch>
                       <a:fillRect/>
                     </a:stretch>
@@ -1360,7 +1101,7 @@
         <mc:AlternateContent>
           <mc:Choice Requires="wps">
             <w:drawing>
-              <wp:anchor distT="0" distB="0" distL="0" distR="0" simplePos="0" relativeHeight="9" behindDoc="0" locked="0" layoutInCell="0" allowOverlap="1">
+              <wp:anchor distT="0" distB="0" distL="0" distR="0" simplePos="0" relativeHeight="9" behindDoc="0" locked="0" layoutInCell="0" allowOverlap="1" wp14:anchorId="04DDC3C4" wp14:editId="04DDC3C5">
                 <wp:simplePos x="0" y="0"/>
                 <wp:positionH relativeFrom="column">
                   <wp:align>center</wp:align>
@@ -1401,7 +1142,7 @@
                                 <w:lang w:val="en-US"/>
                               </w:rPr>
                               <w:drawing>
-                                <wp:inline distT="0" distB="0" distL="0" distR="0">
+                                <wp:inline distT="0" distB="0" distL="0" distR="0" wp14:anchorId="04DDC3D3" wp14:editId="04DDC3D4">
                                   <wp:extent cx="6120130" cy="2096135"/>
                                   <wp:effectExtent l="0" t="0" r="0" b="0"/>
                                   <wp:docPr id="12" name="Image4"/>
@@ -1418,7 +1159,7 @@
                                           </pic:cNvPicPr>
                                         </pic:nvPicPr>
                                         <pic:blipFill>
-                                          <a:blip r:embed="rId11"/>
+                                          <a:blip r:embed="rId14"/>
                                           <a:stretch>
                                             <a:fillRect/>
                                           </a:stretch>
@@ -1439,15 +1180,7 @@
                               </w:drawing>
                             </w:r>
                             <w:r>
-                              <w:t xml:space="preserve">Users can see the full </w:t>
-                            </w:r>
-                            <w:proofErr w:type="spellStart"/>
-                            <w:r>
-                              <w:t>leaderboard</w:t>
-                            </w:r>
-                            <w:proofErr w:type="spellEnd"/>
-                            <w:r>
-                              <w:t>, and they are highlighted in green, to help visual recognition</w:t>
+                              <w:t>Users can see the full leaderboard, and they are highlighted in green, to help visual recognition</w:t>
                             </w:r>
                           </w:p>
                         </w:txbxContent>
@@ -1493,7 +1226,7 @@
                                     </pic:cNvPicPr>
                                   </pic:nvPicPr>
                                   <pic:blipFill>
-                                    <a:blip r:embed="rId11"/>
+                                    <a:blip r:embed="rId15"/>
                                     <a:stretch>
                                       <a:fillRect/>
                                     </a:stretch>
@@ -1541,7 +1274,7 @@
         <mc:AlternateContent>
           <mc:Choice Requires="wps">
             <w:drawing>
-              <wp:anchor distT="0" distB="0" distL="0" distR="0" simplePos="0" relativeHeight="12" behindDoc="0" locked="0" layoutInCell="0" allowOverlap="1">
+              <wp:anchor distT="0" distB="0" distL="0" distR="0" simplePos="0" relativeHeight="12" behindDoc="0" locked="0" layoutInCell="0" allowOverlap="1" wp14:anchorId="04DDC3C6" wp14:editId="04DDC3C7">
                 <wp:simplePos x="0" y="0"/>
                 <wp:positionH relativeFrom="column">
                   <wp:posOffset>-340995</wp:posOffset>
@@ -1582,7 +1315,7 @@
                                 <w:lang w:val="en-US"/>
                               </w:rPr>
                               <w:drawing>
-                                <wp:inline distT="0" distB="0" distL="0" distR="0">
+                                <wp:inline distT="0" distB="0" distL="0" distR="0" wp14:anchorId="04DDC3D5" wp14:editId="04DDC3D6">
                                   <wp:extent cx="6120130" cy="2109470"/>
                                   <wp:effectExtent l="0" t="0" r="0" b="0"/>
                                   <wp:docPr id="15" name="Image6"/>
@@ -1599,7 +1332,7 @@
                                           </pic:cNvPicPr>
                                         </pic:nvPicPr>
                                         <pic:blipFill>
-                                          <a:blip r:embed="rId12"/>
+                                          <a:blip r:embed="rId16"/>
                                           <a:stretch>
                                             <a:fillRect/>
                                           </a:stretch>
@@ -1620,15 +1353,7 @@
                               </w:drawing>
                             </w:r>
                             <w:r>
-                              <w:t xml:space="preserve">Pressing view profile on the </w:t>
-                            </w:r>
-                            <w:proofErr w:type="spellStart"/>
-                            <w:r>
-                              <w:t>leaderboard</w:t>
-                            </w:r>
-                            <w:proofErr w:type="spellEnd"/>
-                            <w:r>
-                              <w:t xml:space="preserve"> will allow students to see the profile of the selected student</w:t>
+                              <w:t>Pressing view profile on the leaderboard will allow students to see the profile of the selected student</w:t>
                             </w:r>
                           </w:p>
                         </w:txbxContent>
@@ -1674,7 +1399,7 @@
                                     </pic:cNvPicPr>
                                   </pic:nvPicPr>
                                   <pic:blipFill>
-                                    <a:blip r:embed="rId12"/>
+                                    <a:blip r:embed="rId17"/>
                                     <a:stretch>
                                       <a:fillRect/>
                                     </a:stretch>
@@ -1720,6 +1445,7 @@
         <w:rPr>
           <w:u w:val="single"/>
         </w:rPr>
+        <w:lastRenderedPageBreak/>
         <w:t>2.4 Joint Positions</w:t>
       </w:r>
       <w:r>
@@ -1735,13 +1461,7 @@
         <w:br/>
       </w:r>
       <w:r>
-        <w:t xml:space="preserve">In order to ensure </w:t>
-      </w:r>
-      <w:r>
-        <w:t>fairness, students will notice that the leader board utilizes joint positions. This was a design choice to ensure users positions accurately represent their performance, in terms of points and the number of courses completed, and allows for better comparis</w:t>
-      </w:r>
-      <w:r>
-        <w:t>ons against other students.</w:t>
+        <w:t>In order to ensure fairness, students will notice that the leader board utilizes joint positions. This was a design choice to ensure users positions accurately represent their performance, in terms of points and the number of courses completed, and allows for better comparisons against other students.</w:t>
       </w:r>
     </w:p>
     <w:p/>
@@ -1752,21 +1472,7 @@
           <w:u w:val="single"/>
         </w:rPr>
         <w:br/>
-        <w:t xml:space="preserve">2.5 Back </w:t>
-      </w:r>
-      <w:proofErr w:type="gramStart"/>
-      <w:r>
-        <w:rPr>
-          <w:u w:val="single"/>
-        </w:rPr>
-        <w:t>To</w:t>
-      </w:r>
-      <w:proofErr w:type="gramEnd"/>
-      <w:r>
-        <w:rPr>
-          <w:u w:val="single"/>
-        </w:rPr>
-        <w:t xml:space="preserve"> Dashboard</w:t>
+        <w:t>2.5 Back To Dashboard</w:t>
       </w:r>
       <w:r>
         <w:rPr>
@@ -1776,7 +1482,7 @@
         <mc:AlternateContent>
           <mc:Choice Requires="wps">
             <w:drawing>
-              <wp:anchor distT="0" distB="0" distL="0" distR="0" simplePos="0" relativeHeight="14" behindDoc="0" locked="0" layoutInCell="0" allowOverlap="1">
+              <wp:anchor distT="0" distB="0" distL="0" distR="0" simplePos="0" relativeHeight="14" behindDoc="0" locked="0" layoutInCell="0" allowOverlap="1" wp14:anchorId="04DDC3C8" wp14:editId="04DDC3C9">
                 <wp:simplePos x="0" y="0"/>
                 <wp:positionH relativeFrom="column">
                   <wp:align>center</wp:align>
@@ -1817,7 +1523,7 @@
                                 <w:lang w:val="en-US"/>
                               </w:rPr>
                               <w:drawing>
-                                <wp:inline distT="0" distB="0" distL="0" distR="0">
+                                <wp:inline distT="0" distB="0" distL="0" distR="0" wp14:anchorId="04DDC3D7" wp14:editId="04DDC3D8">
                                   <wp:extent cx="6120130" cy="2172335"/>
                                   <wp:effectExtent l="0" t="0" r="0" b="0"/>
                                   <wp:docPr id="18" name="Image7"/>
@@ -1834,7 +1540,7 @@
                                           </pic:cNvPicPr>
                                         </pic:nvPicPr>
                                         <pic:blipFill>
-                                          <a:blip r:embed="rId13"/>
+                                          <a:blip r:embed="rId18"/>
                                           <a:stretch>
                                             <a:fillRect/>
                                           </a:stretch>
@@ -1855,15 +1561,7 @@
                               </w:drawing>
                             </w:r>
                             <w:r>
-                              <w:t xml:space="preserve">The global </w:t>
-                            </w:r>
-                            <w:proofErr w:type="spellStart"/>
-                            <w:r>
-                              <w:t>leaderboard</w:t>
-                            </w:r>
-                            <w:proofErr w:type="spellEnd"/>
-                            <w:r>
-                              <w:t xml:space="preserve"> updates, and shows joint positions for users that have the same number of positions</w:t>
+                              <w:t>The global leaderboard updates, and shows joint positions for users that have the same number of positions</w:t>
                             </w:r>
                           </w:p>
                         </w:txbxContent>
@@ -1909,7 +1607,7 @@
                                     </pic:cNvPicPr>
                                   </pic:nvPicPr>
                                   <pic:blipFill>
-                                    <a:blip r:embed="rId13"/>
+                                    <a:blip r:embed="rId19"/>
                                     <a:stretch>
                                       <a:fillRect/>
                                     </a:stretch>
@@ -1959,10 +1657,7 @@
     </w:p>
     <w:p>
       <w:r>
-        <w:t>The leader board page has a “Back to Dashboard” button located at the bottom of the page, w</w:t>
-      </w:r>
-      <w:r>
-        <w:t>hich students can press to return back to the dashboard page.</w:t>
+        <w:t>The leader board page has a “Back to Dashboard” button located at the bottom of the page, which students can press to return back to the dashboard page.</w:t>
       </w:r>
       <w:r>
         <w:rPr>
@@ -1993,6 +1688,7 @@
           <w:bCs/>
           <w:lang w:val="en-US"/>
         </w:rPr>
+        <w:lastRenderedPageBreak/>
         <w:t>3. User Profile Management and Badges</w:t>
       </w:r>
     </w:p>
@@ -2533,6 +2229,7 @@
           <w:bCs/>
           <w:lang w:val="en-US"/>
         </w:rPr>
+        <w:lastRenderedPageBreak/>
         <w:t xml:space="preserve">Allows users to </w:t>
       </w:r>
       <w:r>
@@ -2908,12 +2605,434 @@
         </w:rPr>
         <w:t>criteria and progress</w:t>
       </w:r>
-      <w:r>
-        <w:rPr>
+    </w:p>
+    <w:p>
+      <w:pPr>
+        <w:rPr>
+          <w:b/>
+          <w:bCs/>
+          <w:u w:val="single"/>
+          <w:lang w:val="en-US"/>
+        </w:rPr>
+      </w:pPr>
+      <w:r>
+        <w:rPr>
+          <w:b/>
+          <w:bCs/>
+          <w:u w:val="single"/>
+          <w:lang w:val="en-US"/>
+        </w:rPr>
+        <w:t>4</w:t>
+      </w:r>
+      <w:r>
+        <w:rPr>
+          <w:b/>
+          <w:bCs/>
+          <w:u w:val="single"/>
           <w:lang w:val="en-US"/>
         </w:rPr>
         <w:t>.</w:t>
       </w:r>
+      <w:r>
+        <w:rPr>
+          <w:b/>
+          <w:bCs/>
+          <w:u w:val="single"/>
+          <w:lang w:val="en-US"/>
+        </w:rPr>
+        <w:t>Search and filter</w:t>
+      </w:r>
+    </w:p>
+    <w:p>
+      <w:pPr>
+        <w:pStyle w:val="ListParagraph"/>
+        <w:rPr>
+          <w:lang w:val="en-US"/>
+        </w:rPr>
+      </w:pPr>
+      <w:r>
+        <w:rPr>
+          <w:lang w:val="en-US"/>
+        </w:rPr>
+        <w:t xml:space="preserve">The search and filter enables the user to </w:t>
+      </w:r>
+      <w:r>
+        <w:rPr>
+          <w:lang w:val="en-US"/>
+        </w:rPr>
+        <w:t xml:space="preserve">search through the available courses on the dashboards’ </w:t>
+      </w:r>
+      <w:r>
+        <w:rPr>
+          <w:lang w:val="en-US"/>
+        </w:rPr>
+        <w:t>page</w:t>
+      </w:r>
+      <w:r>
+        <w:rPr>
+          <w:lang w:val="en-US"/>
+        </w:rPr>
+        <w:t xml:space="preserve"> that the IBM </w:t>
+      </w:r>
+      <w:r>
+        <w:rPr>
+          <w:lang w:val="en-US"/>
+        </w:rPr>
+        <w:t xml:space="preserve">courses that are provided. </w:t>
+      </w:r>
+      <w:r>
+        <w:rPr>
+          <w:lang w:val="en-US"/>
+        </w:rPr>
+        <w:t>This will enable the user to easily select which courses they want to start and not have to go through each one of the course that the website provides links to for.</w:t>
+      </w:r>
+    </w:p>
+    <w:p>
+      <w:pPr>
+        <w:pStyle w:val="ListParagraph"/>
+        <w:rPr>
+          <w:lang w:val="en-US"/>
+        </w:rPr>
+      </w:pPr>
+    </w:p>
+    <w:p>
+      <w:pPr>
+        <w:pStyle w:val="ListParagraph"/>
+        <w:rPr>
+          <w:lang w:val="en-US"/>
+        </w:rPr>
+      </w:pPr>
+      <w:r>
+        <w:rPr>
+          <w:b/>
+          <w:bCs/>
+          <w:u w:val="single"/>
+          <w:lang w:val="en-US"/>
+        </w:rPr>
+        <w:t>4</w:t>
+      </w:r>
+      <w:r>
+        <w:rPr>
+          <w:b/>
+          <w:bCs/>
+          <w:u w:val="single"/>
+          <w:lang w:val="en-US"/>
+        </w:rPr>
+        <w:t>.1 Filter</w:t>
+      </w:r>
+      <w:r>
+        <w:rPr>
+          <w:lang w:val="en-US"/>
+        </w:rPr>
+        <w:br/>
+      </w:r>
+      <w:r>
+        <w:rPr>
+          <w:lang w:val="en-US"/>
+        </w:rPr>
+        <w:t xml:space="preserve">You can filter them </w:t>
+      </w:r>
+      <w:r>
+        <w:rPr>
+          <w:lang w:val="en-US"/>
+        </w:rPr>
+        <w:t xml:space="preserve">based on whether the user has: completed, </w:t>
+      </w:r>
+      <w:r>
+        <w:rPr>
+          <w:lang w:val="en-US"/>
+        </w:rPr>
+        <w:t xml:space="preserve">in progress, or not started the courses. Once they have selected a </w:t>
+      </w:r>
+      <w:r>
+        <w:rPr>
+          <w:lang w:val="en-US"/>
+        </w:rPr>
+        <w:t>filter they will press the</w:t>
+      </w:r>
+      <w:r>
+        <w:rPr>
+          <w:lang w:val="en-US"/>
+        </w:rPr>
+        <w:t xml:space="preserve"> filter button to submit the filter choice.</w:t>
+      </w:r>
+      <w:r>
+        <w:rPr>
+          <w:lang w:val="en-US"/>
+        </w:rPr>
+        <w:t xml:space="preserve"> If the user just wants to view </w:t>
+      </w:r>
+      <w:r>
+        <w:rPr>
+          <w:lang w:val="en-US"/>
+        </w:rPr>
+        <w:t xml:space="preserve">all </w:t>
+      </w:r>
+      <w:r>
+        <w:rPr>
+          <w:lang w:val="en-US"/>
+        </w:rPr>
+        <w:t>courses he can also select ‘—select a course—</w:t>
+      </w:r>
+      <w:r>
+        <w:rPr>
+          <w:lang w:val="en-US"/>
+        </w:rPr>
+        <w:t>’ in the filter options (they will have to select the filter button again to return to that state once selected).</w:t>
+      </w:r>
+    </w:p>
+    <w:p>
+      <w:pPr>
+        <w:pStyle w:val="ListParagraph"/>
+        <w:rPr>
+          <w:lang w:val="en-US"/>
+        </w:rPr>
+      </w:pPr>
+    </w:p>
+    <w:p>
+      <w:pPr>
+        <w:pStyle w:val="ListParagraph"/>
+        <w:rPr>
+          <w:lang w:val="en-US"/>
+        </w:rPr>
+      </w:pPr>
+      <w:r>
+        <w:rPr>
+          <w:lang w:val="en-US"/>
+        </w:rPr>
+        <w:t xml:space="preserve">-insert pictures of </w:t>
+      </w:r>
+      <w:r>
+        <w:rPr>
+          <w:lang w:val="en-US"/>
+        </w:rPr>
+        <w:t xml:space="preserve">completed, incomplete, not started, and </w:t>
+      </w:r>
+      <w:r>
+        <w:rPr>
+          <w:lang w:val="en-US"/>
+        </w:rPr>
+        <w:t>‘—select a course—</w:t>
+      </w:r>
+      <w:r>
+        <w:rPr>
+          <w:lang w:val="en-US"/>
+        </w:rPr>
+        <w:t>.</w:t>
+      </w:r>
+    </w:p>
+    <w:p>
+      <w:pPr>
+        <w:pStyle w:val="ListParagraph"/>
+        <w:rPr>
+          <w:lang w:val="en-US"/>
+        </w:rPr>
+      </w:pPr>
+    </w:p>
+    <w:p>
+      <w:pPr>
+        <w:pStyle w:val="ListParagraph"/>
+        <w:rPr>
+          <w:lang w:val="en-US"/>
+        </w:rPr>
+      </w:pPr>
+    </w:p>
+    <w:p>
+      <w:pPr>
+        <w:pStyle w:val="ListParagraph"/>
+        <w:rPr>
+          <w:b/>
+          <w:bCs/>
+          <w:u w:val="single"/>
+          <w:lang w:val="en-US"/>
+        </w:rPr>
+      </w:pPr>
+      <w:r>
+        <w:rPr>
+          <w:b/>
+          <w:bCs/>
+          <w:u w:val="single"/>
+          <w:lang w:val="en-US"/>
+        </w:rPr>
+        <w:t>4</w:t>
+      </w:r>
+      <w:r>
+        <w:rPr>
+          <w:b/>
+          <w:bCs/>
+          <w:u w:val="single"/>
+          <w:lang w:val="en-US"/>
+        </w:rPr>
+        <w:t>.2 Search</w:t>
+      </w:r>
+    </w:p>
+    <w:p>
+      <w:pPr>
+        <w:pStyle w:val="ListParagraph"/>
+        <w:rPr>
+          <w:lang w:val="en-US"/>
+        </w:rPr>
+      </w:pPr>
+      <w:r>
+        <w:rPr>
+          <w:lang w:val="en-US"/>
+        </w:rPr>
+        <w:t>For the search feature,</w:t>
+      </w:r>
+      <w:r>
+        <w:rPr>
+          <w:lang w:val="en-US"/>
+        </w:rPr>
+        <w:t xml:space="preserve"> you have a text box and enter what the name of the courses</w:t>
+      </w:r>
+      <w:r>
+        <w:rPr>
+          <w:lang w:val="en-US"/>
+        </w:rPr>
+        <w:t xml:space="preserve"> that should match what they want. Lets say they enter ‘python’ into the </w:t>
+      </w:r>
+      <w:r>
+        <w:rPr>
+          <w:lang w:val="en-US"/>
+        </w:rPr>
+        <w:t xml:space="preserve">text box the user will then have to press the search button to submit it and the dashboard page will only show </w:t>
+      </w:r>
+      <w:r>
+        <w:rPr>
+          <w:lang w:val="en-US"/>
+        </w:rPr>
+        <w:lastRenderedPageBreak/>
+        <w:t xml:space="preserve">courses that have the word python within their course name to the user. If the user wants to see all courses again they will have to leave </w:t>
+      </w:r>
+      <w:r>
+        <w:rPr>
+          <w:lang w:val="en-US"/>
+        </w:rPr>
+        <w:t xml:space="preserve">the </w:t>
+      </w:r>
+      <w:r>
+        <w:rPr>
+          <w:lang w:val="en-US"/>
+        </w:rPr>
+        <w:t xml:space="preserve">search </w:t>
+      </w:r>
+      <w:r>
+        <w:rPr>
+          <w:lang w:val="en-US"/>
+        </w:rPr>
+        <w:t>text box empty for the user</w:t>
+      </w:r>
+      <w:r>
+        <w:rPr>
+          <w:lang w:val="en-US"/>
+        </w:rPr>
+        <w:t xml:space="preserve"> and press the search button to see all courses again.</w:t>
+      </w:r>
+    </w:p>
+    <w:p>
+      <w:pPr>
+        <w:pStyle w:val="ListParagraph"/>
+        <w:rPr>
+          <w:lang w:val="en-US"/>
+        </w:rPr>
+      </w:pPr>
+    </w:p>
+    <w:p>
+      <w:pPr>
+        <w:pStyle w:val="ListParagraph"/>
+        <w:rPr>
+          <w:lang w:val="en-US"/>
+        </w:rPr>
+      </w:pPr>
+      <w:r>
+        <w:rPr>
+          <w:lang w:val="en-US"/>
+        </w:rPr>
+        <w:t xml:space="preserve">(for context search </w:t>
+      </w:r>
+      <w:r>
+        <w:rPr>
+          <w:lang w:val="en-US"/>
+        </w:rPr>
+        <w:t>text</w:t>
+      </w:r>
+      <w:r>
+        <w:rPr>
+          <w:lang w:val="en-US"/>
+        </w:rPr>
+        <w:t xml:space="preserve"> box </w:t>
+      </w:r>
+      <w:r>
+        <w:rPr>
+          <w:lang w:val="en-US"/>
+        </w:rPr>
+        <w:t xml:space="preserve">needs to be </w:t>
+      </w:r>
+      <w:r>
+        <w:rPr>
+          <w:lang w:val="en-US"/>
+        </w:rPr>
+        <w:t>empty and the button pressed to make sure that it can only show</w:t>
+      </w:r>
+      <w:r>
+        <w:rPr>
+          <w:lang w:val="en-US"/>
+        </w:rPr>
+        <w:t xml:space="preserve"> all</w:t>
+      </w:r>
+      <w:r>
+        <w:rPr>
+          <w:lang w:val="en-US"/>
+        </w:rPr>
+        <w:t xml:space="preserve"> courses tha</w:t>
+      </w:r>
+      <w:r>
+        <w:rPr>
+          <w:lang w:val="en-US"/>
+        </w:rPr>
+        <w:t>t meet the current criteria of what the filter</w:t>
+      </w:r>
+      <w:r>
+        <w:rPr>
+          <w:lang w:val="en-US"/>
+        </w:rPr>
+        <w:t xml:space="preserve"> is on</w:t>
+      </w:r>
+      <w:r>
+        <w:rPr>
+          <w:lang w:val="en-US"/>
+        </w:rPr>
+        <w:t>).</w:t>
+      </w:r>
+    </w:p>
+    <w:p>
+      <w:pPr>
+        <w:pStyle w:val="ListParagraph"/>
+        <w:rPr>
+          <w:lang w:val="en-US"/>
+        </w:rPr>
+      </w:pPr>
+    </w:p>
+    <w:p>
+      <w:pPr>
+        <w:pStyle w:val="ListParagraph"/>
+        <w:rPr>
+          <w:lang w:val="en-US"/>
+        </w:rPr>
+      </w:pPr>
+      <w:r>
+        <w:rPr>
+          <w:lang w:val="en-US"/>
+        </w:rPr>
+        <w:t>-insert pictures of examples of filter working</w:t>
+      </w:r>
+    </w:p>
+    <w:p>
+      <w:pPr>
+        <w:rPr>
+          <w:lang w:val="en-US"/>
+        </w:rPr>
+      </w:pPr>
     </w:p>
     <w:p/>
     <w:p>
@@ -2935,8 +3054,8 @@
 </file>
 
 <file path=word/numbering.xml><?xml version="1.0" encoding="utf-8"?>
-<w:numbering xmlns:wpc="http://schemas.microsoft.com/office/word/2010/wordprocessingCanvas" xmlns:mc="http://schemas.openxmlformats.org/markup-compatibility/2006" xmlns:o="urn:schemas-microsoft-com:office:office" xmlns:r="http://schemas.openxmlformats.org/officeDocument/2006/relationships" xmlns:m="http://schemas.openxmlformats.org/officeDocument/2006/math" xmlns:v="urn:schemas-microsoft-com:vml" xmlns:wp14="http://schemas.microsoft.com/office/word/2010/wordprocessingDrawing" xmlns:wp="http://schemas.openxmlformats.org/drawingml/2006/wordprocessingDrawing" xmlns:w10="urn:schemas-microsoft-com:office:word" xmlns:w="http://schemas.openxmlformats.org/wordprocessingml/2006/main" xmlns:w14="http://schemas.microsoft.com/office/word/2010/wordml" xmlns:w15="http://schemas.microsoft.com/office/word/2012/wordml" xmlns:wpg="http://schemas.microsoft.com/office/word/2010/wordprocessingGroup" xmlns:wpi="http://schemas.microsoft.com/office/word/2010/wordprocessingInk" xmlns:wne="http://schemas.microsoft.com/office/word/2006/wordml" xmlns:wps="http://schemas.microsoft.com/office/word/2010/wordprocessingShape" mc:Ignorable="w14 w15 wp14">
-  <w:abstractNum w:abstractNumId="0">
+<w:numbering xmlns:wpc="http://schemas.microsoft.com/office/word/2010/wordprocessingCanvas" xmlns:cx="http://schemas.microsoft.com/office/drawing/2014/chartex" xmlns:cx1="http://schemas.microsoft.com/office/drawing/2015/9/8/chartex" xmlns:cx2="http://schemas.microsoft.com/office/drawing/2015/10/21/chartex" xmlns:cx3="http://schemas.microsoft.com/office/drawing/2016/5/9/chartex" xmlns:cx4="http://schemas.microsoft.com/office/drawing/2016/5/10/chartex" xmlns:cx5="http://schemas.microsoft.com/office/drawing/2016/5/11/chartex" xmlns:cx6="http://schemas.microsoft.com/office/drawing/2016/5/12/chartex" xmlns:cx7="http://schemas.microsoft.com/office/drawing/2016/5/13/chartex" xmlns:cx8="http://schemas.microsoft.com/office/drawing/2016/5/14/chartex" xmlns:mc="http://schemas.openxmlformats.org/markup-compatibility/2006" xmlns:aink="http://schemas.microsoft.com/office/drawing/2016/ink" xmlns:am3d="http://schemas.microsoft.com/office/drawing/2017/model3d" xmlns:o="urn:schemas-microsoft-com:office:office" xmlns:oel="http://schemas.microsoft.com/office/2019/extlst" xmlns:r="http://schemas.openxmlformats.org/officeDocument/2006/relationships" xmlns:m="http://schemas.openxmlformats.org/officeDocument/2006/math" xmlns:v="urn:schemas-microsoft-com:vml" xmlns:wp14="http://schemas.microsoft.com/office/word/2010/wordprocessingDrawing" xmlns:wp="http://schemas.openxmlformats.org/drawingml/2006/wordprocessingDrawing" xmlns:w10="urn:schemas-microsoft-com:office:word" xmlns:w="http://schemas.openxmlformats.org/wordprocessingml/2006/main" xmlns:w14="http://schemas.microsoft.com/office/word/2010/wordml" xmlns:w15="http://schemas.microsoft.com/office/word/2012/wordml" xmlns:w16cex="http://schemas.microsoft.com/office/word/2018/wordml/cex" xmlns:w16cid="http://schemas.microsoft.com/office/word/2016/wordml/cid" xmlns:w16="http://schemas.microsoft.com/office/word/2018/wordml" xmlns:w16du="http://schemas.microsoft.com/office/word/2023/wordml/word16du" xmlns:w16sdtdh="http://schemas.microsoft.com/office/word/2020/wordml/sdtdatahash" xmlns:w16sdtfl="http://schemas.microsoft.com/office/word/2024/wordml/sdtformatlock" xmlns:w16se="http://schemas.microsoft.com/office/word/2015/wordml/symex" xmlns:wpg="http://schemas.microsoft.com/office/word/2010/wordprocessingGroup" xmlns:wpi="http://schemas.microsoft.com/office/word/2010/wordprocessingInk" xmlns:wne="http://schemas.microsoft.com/office/word/2006/wordml" xmlns:wps="http://schemas.microsoft.com/office/word/2010/wordprocessingShape" mc:Ignorable="w14 w15 w16se w16cid w16 w16cex w16sdtdh w16sdtfl w16du wp14">
+  <w:abstractNum w:abstractNumId="0" w15:restartNumberingAfterBreak="0">
     <w:nsid w:val="03D70A73"/>
     <w:multiLevelType w:val="multilevel"/>
     <w:tmpl w:val="07FCCC2A"/>
@@ -3085,7 +3204,7 @@
       </w:rPr>
     </w:lvl>
   </w:abstractNum>
-  <w:abstractNum w:abstractNumId="1">
+  <w:abstractNum w:abstractNumId="1" w15:restartNumberingAfterBreak="0">
     <w:nsid w:val="0D5C44E5"/>
     <w:multiLevelType w:val="multilevel"/>
     <w:tmpl w:val="B3348786"/>
@@ -3234,7 +3353,96 @@
       </w:rPr>
     </w:lvl>
   </w:abstractNum>
-  <w:abstractNum w:abstractNumId="2">
+  <w:abstractNum w:abstractNumId="2" w15:restartNumberingAfterBreak="0">
+    <w:nsid w:val="180B03BD"/>
+    <w:multiLevelType w:val="hybridMultilevel"/>
+    <w:tmpl w:val="2C1A4A10"/>
+    <w:lvl w:ilvl="0" w:tplc="0409000F">
+      <w:start w:val="1"/>
+      <w:numFmt w:val="decimal"/>
+      <w:lvlText w:val="%1."/>
+      <w:lvlJc w:val="left"/>
+      <w:pPr>
+        <w:ind w:left="1080" w:hanging="360"/>
+      </w:pPr>
+      <w:rPr>
+        <w:rFonts w:hint="default"/>
+      </w:rPr>
+    </w:lvl>
+    <w:lvl w:ilvl="1" w:tplc="08090019" w:tentative="1">
+      <w:start w:val="1"/>
+      <w:numFmt w:val="lowerLetter"/>
+      <w:lvlText w:val="%2."/>
+      <w:lvlJc w:val="left"/>
+      <w:pPr>
+        <w:ind w:left="1800" w:hanging="360"/>
+      </w:pPr>
+    </w:lvl>
+    <w:lvl w:ilvl="2" w:tplc="0809001B" w:tentative="1">
+      <w:start w:val="1"/>
+      <w:numFmt w:val="lowerRoman"/>
+      <w:lvlText w:val="%3."/>
+      <w:lvlJc w:val="right"/>
+      <w:pPr>
+        <w:ind w:left="2520" w:hanging="180"/>
+      </w:pPr>
+    </w:lvl>
+    <w:lvl w:ilvl="3" w:tplc="0809000F" w:tentative="1">
+      <w:start w:val="1"/>
+      <w:numFmt w:val="decimal"/>
+      <w:lvlText w:val="%4."/>
+      <w:lvlJc w:val="left"/>
+      <w:pPr>
+        <w:ind w:left="3240" w:hanging="360"/>
+      </w:pPr>
+    </w:lvl>
+    <w:lvl w:ilvl="4" w:tplc="08090019" w:tentative="1">
+      <w:start w:val="1"/>
+      <w:numFmt w:val="lowerLetter"/>
+      <w:lvlText w:val="%5."/>
+      <w:lvlJc w:val="left"/>
+      <w:pPr>
+        <w:ind w:left="3960" w:hanging="360"/>
+      </w:pPr>
+    </w:lvl>
+    <w:lvl w:ilvl="5" w:tplc="0809001B" w:tentative="1">
+      <w:start w:val="1"/>
+      <w:numFmt w:val="lowerRoman"/>
+      <w:lvlText w:val="%6."/>
+      <w:lvlJc w:val="right"/>
+      <w:pPr>
+        <w:ind w:left="4680" w:hanging="180"/>
+      </w:pPr>
+    </w:lvl>
+    <w:lvl w:ilvl="6" w:tplc="0809000F" w:tentative="1">
+      <w:start w:val="1"/>
+      <w:numFmt w:val="decimal"/>
+      <w:lvlText w:val="%7."/>
+      <w:lvlJc w:val="left"/>
+      <w:pPr>
+        <w:ind w:left="5400" w:hanging="360"/>
+      </w:pPr>
+    </w:lvl>
+    <w:lvl w:ilvl="7" w:tplc="08090019" w:tentative="1">
+      <w:start w:val="1"/>
+      <w:numFmt w:val="lowerLetter"/>
+      <w:lvlText w:val="%8."/>
+      <w:lvlJc w:val="left"/>
+      <w:pPr>
+        <w:ind w:left="6120" w:hanging="360"/>
+      </w:pPr>
+    </w:lvl>
+    <w:lvl w:ilvl="8" w:tplc="0809001B" w:tentative="1">
+      <w:start w:val="1"/>
+      <w:numFmt w:val="lowerRoman"/>
+      <w:lvlText w:val="%9."/>
+      <w:lvlJc w:val="right"/>
+      <w:pPr>
+        <w:ind w:left="6840" w:hanging="180"/>
+      </w:pPr>
+    </w:lvl>
+  </w:abstractNum>
+  <w:abstractNum w:abstractNumId="3" w15:restartNumberingAfterBreak="0">
     <w:nsid w:val="19B02650"/>
     <w:multiLevelType w:val="multilevel"/>
     <w:tmpl w:val="E8C0C056"/>
@@ -3383,7 +3591,7 @@
       </w:rPr>
     </w:lvl>
   </w:abstractNum>
-  <w:abstractNum w:abstractNumId="3">
+  <w:abstractNum w:abstractNumId="4" w15:restartNumberingAfterBreak="0">
     <w:nsid w:val="227E0203"/>
     <w:multiLevelType w:val="multilevel"/>
     <w:tmpl w:val="AE0805C2"/>
@@ -3532,7 +3740,7 @@
       </w:rPr>
     </w:lvl>
   </w:abstractNum>
-  <w:abstractNum w:abstractNumId="4">
+  <w:abstractNum w:abstractNumId="5" w15:restartNumberingAfterBreak="0">
     <w:nsid w:val="25432EBD"/>
     <w:multiLevelType w:val="multilevel"/>
     <w:tmpl w:val="A88226A6"/>
@@ -3681,7 +3889,7 @@
       </w:rPr>
     </w:lvl>
   </w:abstractNum>
-  <w:abstractNum w:abstractNumId="5">
+  <w:abstractNum w:abstractNumId="6" w15:restartNumberingAfterBreak="0">
     <w:nsid w:val="29391951"/>
     <w:multiLevelType w:val="multilevel"/>
     <w:tmpl w:val="BE4E33A0"/>
@@ -3797,7 +4005,7 @@
       </w:pPr>
     </w:lvl>
   </w:abstractNum>
-  <w:abstractNum w:abstractNumId="6">
+  <w:abstractNum w:abstractNumId="7" w15:restartNumberingAfterBreak="0">
     <w:nsid w:val="2BAB0BF2"/>
     <w:multiLevelType w:val="multilevel"/>
     <w:tmpl w:val="C548190E"/>
@@ -3946,7 +4154,7 @@
       </w:rPr>
     </w:lvl>
   </w:abstractNum>
-  <w:abstractNum w:abstractNumId="7">
+  <w:abstractNum w:abstractNumId="8" w15:restartNumberingAfterBreak="0">
     <w:nsid w:val="33ED51BF"/>
     <w:multiLevelType w:val="hybridMultilevel"/>
     <w:tmpl w:val="48901C52"/>
@@ -4035,7 +4243,93 @@
       </w:pPr>
     </w:lvl>
   </w:abstractNum>
-  <w:abstractNum w:abstractNumId="8">
+  <w:abstractNum w:abstractNumId="9" w15:restartNumberingAfterBreak="0">
+    <w:nsid w:val="38357FD9"/>
+    <w:multiLevelType w:val="multilevel"/>
+    <w:tmpl w:val="0809001F"/>
+    <w:lvl w:ilvl="0">
+      <w:start w:val="1"/>
+      <w:numFmt w:val="decimal"/>
+      <w:lvlText w:val="%1."/>
+      <w:lvlJc w:val="left"/>
+      <w:pPr>
+        <w:ind w:left="360" w:hanging="360"/>
+      </w:pPr>
+    </w:lvl>
+    <w:lvl w:ilvl="1">
+      <w:start w:val="1"/>
+      <w:numFmt w:val="decimal"/>
+      <w:lvlText w:val="%1.%2."/>
+      <w:lvlJc w:val="left"/>
+      <w:pPr>
+        <w:ind w:left="792" w:hanging="432"/>
+      </w:pPr>
+    </w:lvl>
+    <w:lvl w:ilvl="2">
+      <w:start w:val="1"/>
+      <w:numFmt w:val="decimal"/>
+      <w:lvlText w:val="%1.%2.%3."/>
+      <w:lvlJc w:val="left"/>
+      <w:pPr>
+        <w:ind w:left="1224" w:hanging="504"/>
+      </w:pPr>
+    </w:lvl>
+    <w:lvl w:ilvl="3">
+      <w:start w:val="1"/>
+      <w:numFmt w:val="decimal"/>
+      <w:lvlText w:val="%1.%2.%3.%4."/>
+      <w:lvlJc w:val="left"/>
+      <w:pPr>
+        <w:ind w:left="1728" w:hanging="648"/>
+      </w:pPr>
+    </w:lvl>
+    <w:lvl w:ilvl="4">
+      <w:start w:val="1"/>
+      <w:numFmt w:val="decimal"/>
+      <w:lvlText w:val="%1.%2.%3.%4.%5."/>
+      <w:lvlJc w:val="left"/>
+      <w:pPr>
+        <w:ind w:left="2232" w:hanging="792"/>
+      </w:pPr>
+    </w:lvl>
+    <w:lvl w:ilvl="5">
+      <w:start w:val="1"/>
+      <w:numFmt w:val="decimal"/>
+      <w:lvlText w:val="%1.%2.%3.%4.%5.%6."/>
+      <w:lvlJc w:val="left"/>
+      <w:pPr>
+        <w:ind w:left="2736" w:hanging="936"/>
+      </w:pPr>
+    </w:lvl>
+    <w:lvl w:ilvl="6">
+      <w:start w:val="1"/>
+      <w:numFmt w:val="decimal"/>
+      <w:lvlText w:val="%1.%2.%3.%4.%5.%6.%7."/>
+      <w:lvlJc w:val="left"/>
+      <w:pPr>
+        <w:ind w:left="3240" w:hanging="1080"/>
+      </w:pPr>
+    </w:lvl>
+    <w:lvl w:ilvl="7">
+      <w:start w:val="1"/>
+      <w:numFmt w:val="decimal"/>
+      <w:lvlText w:val="%1.%2.%3.%4.%5.%6.%7.%8."/>
+      <w:lvlJc w:val="left"/>
+      <w:pPr>
+        <w:ind w:left="3744" w:hanging="1224"/>
+      </w:pPr>
+    </w:lvl>
+    <w:lvl w:ilvl="8">
+      <w:start w:val="1"/>
+      <w:numFmt w:val="decimal"/>
+      <w:lvlText w:val="%1.%2.%3.%4.%5.%6.%7.%8.%9."/>
+      <w:lvlJc w:val="left"/>
+      <w:pPr>
+        <w:ind w:left="4320" w:hanging="1440"/>
+      </w:pPr>
+    </w:lvl>
+  </w:abstractNum>
+  <w:abstractNum w:abstractNumId="10" w15:restartNumberingAfterBreak="0">
     <w:nsid w:val="387C27BB"/>
     <w:multiLevelType w:val="multilevel"/>
     <w:tmpl w:val="D81EA4A6"/>
@@ -4184,7 +4478,93 @@
       </w:rPr>
     </w:lvl>
   </w:abstractNum>
-  <w:abstractNum w:abstractNumId="9">
+  <w:abstractNum w:abstractNumId="11" w15:restartNumberingAfterBreak="0">
+    <w:nsid w:val="3C610324"/>
+    <w:multiLevelType w:val="multilevel"/>
+    <w:tmpl w:val="0809001F"/>
+    <w:lvl w:ilvl="0">
+      <w:start w:val="1"/>
+      <w:numFmt w:val="decimal"/>
+      <w:lvlText w:val="%1."/>
+      <w:lvlJc w:val="left"/>
+      <w:pPr>
+        <w:ind w:left="360" w:hanging="360"/>
+      </w:pPr>
+    </w:lvl>
+    <w:lvl w:ilvl="1">
+      <w:start w:val="1"/>
+      <w:numFmt w:val="decimal"/>
+      <w:lvlText w:val="%1.%2."/>
+      <w:lvlJc w:val="left"/>
+      <w:pPr>
+        <w:ind w:left="792" w:hanging="432"/>
+      </w:pPr>
+    </w:lvl>
+    <w:lvl w:ilvl="2">
+      <w:start w:val="1"/>
+      <w:numFmt w:val="decimal"/>
+      <w:lvlText w:val="%1.%2.%3."/>
+      <w:lvlJc w:val="left"/>
+      <w:pPr>
+        <w:ind w:left="1224" w:hanging="504"/>
+      </w:pPr>
+    </w:lvl>
+    <w:lvl w:ilvl="3">
+      <w:start w:val="1"/>
+      <w:numFmt w:val="decimal"/>
+      <w:lvlText w:val="%1.%2.%3.%4."/>
+      <w:lvlJc w:val="left"/>
+      <w:pPr>
+        <w:ind w:left="1728" w:hanging="648"/>
+      </w:pPr>
+    </w:lvl>
+    <w:lvl w:ilvl="4">
+      <w:start w:val="1"/>
+      <w:numFmt w:val="decimal"/>
+      <w:lvlText w:val="%1.%2.%3.%4.%5."/>
+      <w:lvlJc w:val="left"/>
+      <w:pPr>
+        <w:ind w:left="2232" w:hanging="792"/>
+      </w:pPr>
+    </w:lvl>
+    <w:lvl w:ilvl="5">
+      <w:start w:val="1"/>
+      <w:numFmt w:val="decimal"/>
+      <w:lvlText w:val="%1.%2.%3.%4.%5.%6."/>
+      <w:lvlJc w:val="left"/>
+      <w:pPr>
+        <w:ind w:left="2736" w:hanging="936"/>
+      </w:pPr>
+    </w:lvl>
+    <w:lvl w:ilvl="6">
+      <w:start w:val="1"/>
+      <w:numFmt w:val="decimal"/>
+      <w:lvlText w:val="%1.%2.%3.%4.%5.%6.%7."/>
+      <w:lvlJc w:val="left"/>
+      <w:pPr>
+        <w:ind w:left="3240" w:hanging="1080"/>
+      </w:pPr>
+    </w:lvl>
+    <w:lvl w:ilvl="7">
+      <w:start w:val="1"/>
+      <w:numFmt w:val="decimal"/>
+      <w:lvlText w:val="%1.%2.%3.%4.%5.%6.%7.%8."/>
+      <w:lvlJc w:val="left"/>
+      <w:pPr>
+        <w:ind w:left="3744" w:hanging="1224"/>
+      </w:pPr>
+    </w:lvl>
+    <w:lvl w:ilvl="8">
+      <w:start w:val="1"/>
+      <w:numFmt w:val="decimal"/>
+      <w:lvlText w:val="%1.%2.%3.%4.%5.%6.%7.%8.%9."/>
+      <w:lvlJc w:val="left"/>
+      <w:pPr>
+        <w:ind w:left="4320" w:hanging="1440"/>
+      </w:pPr>
+    </w:lvl>
+  </w:abstractNum>
+  <w:abstractNum w:abstractNumId="12" w15:restartNumberingAfterBreak="0">
     <w:nsid w:val="41AA6217"/>
     <w:multiLevelType w:val="multilevel"/>
     <w:tmpl w:val="C3D09316"/>
@@ -4333,7 +4713,7 @@
       </w:rPr>
     </w:lvl>
   </w:abstractNum>
-  <w:abstractNum w:abstractNumId="10">
+  <w:abstractNum w:abstractNumId="13" w15:restartNumberingAfterBreak="0">
     <w:nsid w:val="42A5743B"/>
     <w:multiLevelType w:val="multilevel"/>
     <w:tmpl w:val="8D6C13B0"/>
@@ -4482,7 +4862,7 @@
       </w:rPr>
     </w:lvl>
   </w:abstractNum>
-  <w:abstractNum w:abstractNumId="11">
+  <w:abstractNum w:abstractNumId="14" w15:restartNumberingAfterBreak="0">
     <w:nsid w:val="445C3565"/>
     <w:multiLevelType w:val="multilevel"/>
     <w:tmpl w:val="5CB04B10"/>
@@ -4631,10 +5011,10 @@
       </w:rPr>
     </w:lvl>
   </w:abstractNum>
-  <w:abstractNum w:abstractNumId="12">
+  <w:abstractNum w:abstractNumId="15" w15:restartNumberingAfterBreak="0">
     <w:nsid w:val="46D77447"/>
     <w:multiLevelType w:val="multilevel"/>
-    <w:tmpl w:val="177E9CD4"/>
+    <w:tmpl w:val="126AED94"/>
     <w:lvl w:ilvl="0">
       <w:start w:val="1"/>
       <w:numFmt w:val="bullet"/>
@@ -4651,20 +5031,16 @@
         <w:sz w:val="20"/>
       </w:rPr>
     </w:lvl>
-    <w:lvl w:ilvl="1" w:tentative="1">
-      <w:start w:val="1"/>
-      <w:numFmt w:val="bullet"/>
-      <w:lvlText w:val="o"/>
-      <w:lvlJc w:val="left"/>
-      <w:pPr>
-        <w:tabs>
-          <w:tab w:val="num" w:pos="1440"/>
-        </w:tabs>
+    <w:lvl w:ilvl="1">
+      <w:start w:val="4"/>
+      <w:numFmt w:val="decimal"/>
+      <w:lvlText w:val="%2."/>
+      <w:lvlJc w:val="left"/>
+      <w:pPr>
         <w:ind w:left="1440" w:hanging="360"/>
       </w:pPr>
       <w:rPr>
-        <w:rFonts w:ascii="Courier New" w:hAnsi="Courier New" w:hint="default"/>
-        <w:sz w:val="20"/>
+        <w:rFonts w:hint="default"/>
       </w:rPr>
     </w:lvl>
     <w:lvl w:ilvl="2" w:tentative="1">
@@ -4780,7 +5156,7 @@
       </w:rPr>
     </w:lvl>
   </w:abstractNum>
-  <w:abstractNum w:abstractNumId="13">
+  <w:abstractNum w:abstractNumId="16" w15:restartNumberingAfterBreak="0">
     <w:nsid w:val="4F4428D5"/>
     <w:multiLevelType w:val="multilevel"/>
     <w:tmpl w:val="5EB018E6"/>
@@ -4929,7 +5305,7 @@
       </w:rPr>
     </w:lvl>
   </w:abstractNum>
-  <w:abstractNum w:abstractNumId="14">
+  <w:abstractNum w:abstractNumId="17" w15:restartNumberingAfterBreak="0">
     <w:nsid w:val="502D153C"/>
     <w:multiLevelType w:val="multilevel"/>
     <w:tmpl w:val="8828FF0E"/>
@@ -5078,7 +5454,7 @@
       </w:rPr>
     </w:lvl>
   </w:abstractNum>
-  <w:abstractNum w:abstractNumId="15">
+  <w:abstractNum w:abstractNumId="18" w15:restartNumberingAfterBreak="0">
     <w:nsid w:val="5F0625A8"/>
     <w:multiLevelType w:val="multilevel"/>
     <w:tmpl w:val="CE42726E"/>
@@ -5227,7 +5603,7 @@
       </w:rPr>
     </w:lvl>
   </w:abstractNum>
-  <w:abstractNum w:abstractNumId="16">
+  <w:abstractNum w:abstractNumId="19" w15:restartNumberingAfterBreak="0">
     <w:nsid w:val="6FA44483"/>
     <w:multiLevelType w:val="multilevel"/>
     <w:tmpl w:val="39E8C2C8"/>
@@ -5376,7 +5752,7 @@
       </w:rPr>
     </w:lvl>
   </w:abstractNum>
-  <w:abstractNum w:abstractNumId="17">
+  <w:abstractNum w:abstractNumId="20" w15:restartNumberingAfterBreak="0">
     <w:nsid w:val="77AC5D83"/>
     <w:multiLevelType w:val="multilevel"/>
     <w:tmpl w:val="6BB2F0C6"/>
@@ -5525,7 +5901,7 @@
       </w:rPr>
     </w:lvl>
   </w:abstractNum>
-  <w:abstractNum w:abstractNumId="18">
+  <w:abstractNum w:abstractNumId="21" w15:restartNumberingAfterBreak="0">
     <w:nsid w:val="78D13ADA"/>
     <w:multiLevelType w:val="multilevel"/>
     <w:tmpl w:val="088EA55C"/>
@@ -5647,7 +6023,7 @@
       </w:pPr>
     </w:lvl>
   </w:abstractNum>
-  <w:abstractNum w:abstractNumId="19">
+  <w:abstractNum w:abstractNumId="22" w15:restartNumberingAfterBreak="0">
     <w:nsid w:val="7B803607"/>
     <w:multiLevelType w:val="multilevel"/>
     <w:tmpl w:val="D956590A"/>
@@ -5796,71 +6172,80 @@
       </w:rPr>
     </w:lvl>
   </w:abstractNum>
-  <w:num w:numId="1">
+  <w:num w:numId="1" w16cid:durableId="769277556">
+    <w:abstractNumId w:val="16"/>
+  </w:num>
+  <w:num w:numId="2" w16cid:durableId="2062291254">
     <w:abstractNumId w:val="13"/>
   </w:num>
-  <w:num w:numId="2">
+  <w:num w:numId="3" w16cid:durableId="1001858054">
+    <w:abstractNumId w:val="17"/>
+  </w:num>
+  <w:num w:numId="4" w16cid:durableId="2108456114">
+    <w:abstractNumId w:val="12"/>
+  </w:num>
+  <w:num w:numId="5" w16cid:durableId="2055303146">
+    <w:abstractNumId w:val="4"/>
+  </w:num>
+  <w:num w:numId="6" w16cid:durableId="774061992">
+    <w:abstractNumId w:val="3"/>
+  </w:num>
+  <w:num w:numId="7" w16cid:durableId="30999478">
+    <w:abstractNumId w:val="6"/>
+  </w:num>
+  <w:num w:numId="8" w16cid:durableId="1031303540">
+    <w:abstractNumId w:val="21"/>
+  </w:num>
+  <w:num w:numId="9" w16cid:durableId="1999844853">
+    <w:abstractNumId w:val="18"/>
+  </w:num>
+  <w:num w:numId="10" w16cid:durableId="1209301699">
+    <w:abstractNumId w:val="7"/>
+  </w:num>
+  <w:num w:numId="11" w16cid:durableId="427888997">
     <w:abstractNumId w:val="10"/>
   </w:num>
-  <w:num w:numId="3">
+  <w:num w:numId="12" w16cid:durableId="1041975923">
+    <w:abstractNumId w:val="20"/>
+  </w:num>
+  <w:num w:numId="13" w16cid:durableId="367294939">
     <w:abstractNumId w:val="14"/>
   </w:num>
-  <w:num w:numId="4">
+  <w:num w:numId="14" w16cid:durableId="1788700278">
+    <w:abstractNumId w:val="22"/>
+  </w:num>
+  <w:num w:numId="15" w16cid:durableId="873346242">
+    <w:abstractNumId w:val="5"/>
+  </w:num>
+  <w:num w:numId="16" w16cid:durableId="158546038">
+    <w:abstractNumId w:val="0"/>
+  </w:num>
+  <w:num w:numId="17" w16cid:durableId="1085030879">
+    <w:abstractNumId w:val="19"/>
+  </w:num>
+  <w:num w:numId="18" w16cid:durableId="712772847">
+    <w:abstractNumId w:val="1"/>
+  </w:num>
+  <w:num w:numId="19" w16cid:durableId="1869563687">
+    <w:abstractNumId w:val="15"/>
+  </w:num>
+  <w:num w:numId="20" w16cid:durableId="1790975157">
+    <w:abstractNumId w:val="8"/>
+  </w:num>
+  <w:num w:numId="21" w16cid:durableId="1944026074">
     <w:abstractNumId w:val="9"/>
   </w:num>
-  <w:num w:numId="5">
-    <w:abstractNumId w:val="3"/>
-  </w:num>
-  <w:num w:numId="6">
+  <w:num w:numId="22" w16cid:durableId="1292444864">
     <w:abstractNumId w:val="2"/>
   </w:num>
-  <w:num w:numId="7">
-    <w:abstractNumId w:val="5"/>
-  </w:num>
-  <w:num w:numId="8">
-    <w:abstractNumId w:val="18"/>
-  </w:num>
-  <w:num w:numId="9">
-    <w:abstractNumId w:val="15"/>
-  </w:num>
-  <w:num w:numId="10">
-    <w:abstractNumId w:val="6"/>
-  </w:num>
-  <w:num w:numId="11">
-    <w:abstractNumId w:val="8"/>
-  </w:num>
-  <w:num w:numId="12">
-    <w:abstractNumId w:val="17"/>
-  </w:num>
-  <w:num w:numId="13">
+  <w:num w:numId="23" w16cid:durableId="980965856">
     <w:abstractNumId w:val="11"/>
-  </w:num>
-  <w:num w:numId="14">
-    <w:abstractNumId w:val="19"/>
-  </w:num>
-  <w:num w:numId="15">
-    <w:abstractNumId w:val="4"/>
-  </w:num>
-  <w:num w:numId="16">
-    <w:abstractNumId w:val="0"/>
-  </w:num>
-  <w:num w:numId="17">
-    <w:abstractNumId w:val="16"/>
-  </w:num>
-  <w:num w:numId="18">
-    <w:abstractNumId w:val="1"/>
-  </w:num>
-  <w:num w:numId="19">
-    <w:abstractNumId w:val="12"/>
-  </w:num>
-  <w:num w:numId="20">
-    <w:abstractNumId w:val="7"/>
   </w:num>
 </w:numbering>
 </file>
 
 <file path=word/styles.xml><?xml version="1.0" encoding="utf-8"?>
-<w:styles xmlns:mc="http://schemas.openxmlformats.org/markup-compatibility/2006" xmlns:r="http://schemas.openxmlformats.org/officeDocument/2006/relationships" xmlns:w="http://schemas.openxmlformats.org/wordprocessingml/2006/main" xmlns:w14="http://schemas.microsoft.com/office/word/2010/wordml" xmlns:w15="http://schemas.microsoft.com/office/word/2012/wordml" mc:Ignorable="w14 w15">
+<w:styles xmlns:mc="http://schemas.openxmlformats.org/markup-compatibility/2006" xmlns:r="http://schemas.openxmlformats.org/officeDocument/2006/relationships" xmlns:w="http://schemas.openxmlformats.org/wordprocessingml/2006/main" xmlns:w14="http://schemas.microsoft.com/office/word/2010/wordml" xmlns:w15="http://schemas.microsoft.com/office/word/2012/wordml" xmlns:w16cex="http://schemas.microsoft.com/office/word/2018/wordml/cex" xmlns:w16cid="http://schemas.microsoft.com/office/word/2016/wordml/cid" xmlns:w16="http://schemas.microsoft.com/office/word/2018/wordml" xmlns:w16du="http://schemas.microsoft.com/office/word/2023/wordml/word16du" xmlns:w16sdtdh="http://schemas.microsoft.com/office/word/2020/wordml/sdtdatahash" xmlns:w16sdtfl="http://schemas.microsoft.com/office/word/2024/wordml/sdtformatlock" xmlns:w16se="http://schemas.microsoft.com/office/word/2015/wordml/symex" mc:Ignorable="w14 w15 w16se w16cid w16 w16cex w16sdtdh w16sdtfl w16du">
   <w:docDefaults>
     <w:rPrDefault>
       <w:rPr>
@@ -5876,7 +6261,7 @@
       </w:pPr>
     </w:pPrDefault>
   </w:docDefaults>
-  <w:latentStyles w:defLockedState="0" w:defUIPriority="99" w:defSemiHidden="0" w:defUnhideWhenUsed="0" w:defQFormat="0" w:count="371">
+  <w:latentStyles w:defLockedState="0" w:defUIPriority="99" w:defSemiHidden="0" w:defUnhideWhenUsed="0" w:defQFormat="0" w:count="376">
     <w:lsdException w:name="Normal" w:uiPriority="0" w:qFormat="1"/>
     <w:lsdException w:name="heading 1" w:uiPriority="9" w:qFormat="1"/>
     <w:lsdException w:name="heading 2" w:semiHidden="1" w:uiPriority="9" w:unhideWhenUsed="1" w:qFormat="1"/>
@@ -6248,6 +6633,11 @@
     <w:lsdException w:name="List Table 5 Dark Accent 6" w:uiPriority="50"/>
     <w:lsdException w:name="List Table 6 Colorful Accent 6" w:uiPriority="51"/>
     <w:lsdException w:name="List Table 7 Colorful Accent 6" w:uiPriority="52"/>
+    <w:lsdException w:name="Mention" w:semiHidden="1" w:unhideWhenUsed="1"/>
+    <w:lsdException w:name="Smart Hyperlink" w:semiHidden="1" w:unhideWhenUsed="1"/>
+    <w:lsdException w:name="Hashtag" w:semiHidden="1" w:unhideWhenUsed="1"/>
+    <w:lsdException w:name="Unresolved Mention" w:semiHidden="1" w:unhideWhenUsed="1"/>
+    <w:lsdException w:name="Smart Link" w:semiHidden="1" w:unhideWhenUsed="1"/>
   </w:latentStyles>
   <w:style w:type="paragraph" w:default="1" w:styleId="Normal">
     <w:name w:val="Normal"/>
@@ -6458,6 +6848,7 @@
   <w:style w:type="character" w:default="1" w:styleId="DefaultParagraphFont">
     <w:name w:val="Default Paragraph Font"/>
     <w:uiPriority w:val="1"/>
+    <w:semiHidden/>
     <w:unhideWhenUsed/>
   </w:style>
   <w:style w:type="table" w:default="1" w:styleId="TableNormal">
@@ -7029,4 +7420,16 @@
   <a:objectDefaults/>
   <a:extraClrSchemeLst/>
 </a:theme>
+</file>
+
+<file path=customXml/item1.xml><?xml version="1.0" encoding="utf-8"?>
+<b:Sources xmlns:b="http://schemas.openxmlformats.org/officeDocument/2006/bibliography" xmlns="http://schemas.openxmlformats.org/officeDocument/2006/bibliography" SelectedStyle="\APASixthEditionOfficeOnline.xsl" StyleName="APA" Version="6"/>
+</file>
+
+<file path=customXml/itemProps1.xml><?xml version="1.0" encoding="utf-8"?>
+<ds:datastoreItem xmlns:ds="http://schemas.openxmlformats.org/officeDocument/2006/customXml" ds:itemID="{0A71370A-3E95-4C91-8E37-D8B19D6E0069}">
+  <ds:schemaRefs>
+    <ds:schemaRef ds:uri="http://schemas.openxmlformats.org/officeDocument/2006/bibliography"/>
+  </ds:schemaRefs>
+</ds:datastoreItem>
 </file>
</xml_diff>